<commit_message>
app works but it must ceck update and add dc from dc not only cv
</commit_message>
<xml_diff>
--- a/dossier_competences.docx
+++ b/dossier_competences.docx
@@ -1,6 +1,6 @@
 
 <file path=word/document.xml><?xml version="1.0" encoding="utf-8"?>
-<w:document xmlns:wpc="http://schemas.microsoft.com/office/word/2010/wordprocessingCanvas" xmlns:cx="http://schemas.microsoft.com/office/drawing/2014/chartex" xmlns:cx1="http://schemas.microsoft.com/office/drawing/2015/9/8/chartex" xmlns:cx2="http://schemas.microsoft.com/office/drawing/2015/10/21/chartex" xmlns:cx3="http://schemas.microsoft.com/office/drawing/2016/5/9/chartex" xmlns:cx4="http://schemas.microsoft.com/office/drawing/2016/5/10/chartex" xmlns:cx5="http://schemas.microsoft.com/office/drawing/2016/5/11/chartex" xmlns:cx6="http://schemas.microsoft.com/office/drawing/2016/5/12/chartex" xmlns:cx7="http://schemas.microsoft.com/office/drawing/2016/5/13/chartex" xmlns:cx8="http://schemas.microsoft.com/office/drawing/2016/5/14/chartex" xmlns:mc="http://schemas.openxmlformats.org/markup-compatibility/2006" xmlns:aink="http://schemas.microsoft.com/office/drawing/2016/ink" xmlns:am3d="http://schemas.microsoft.com/office/drawing/2017/model3d" xmlns:o="urn:schemas-microsoft-com:office:office" xmlns:oel="http://schemas.microsoft.com/office/2019/extlst" xmlns:r="http://schemas.openxmlformats.org/officeDocument/2006/relationships" xmlns:m="http://schemas.openxmlformats.org/officeDocument/2006/math" xmlns:v="urn:schemas-microsoft-com:vml" xmlns:wp14="http://schemas.microsoft.com/office/word/2010/wordprocessingDrawing" xmlns:wp="http://schemas.openxmlformats.org/drawingml/2006/wordprocessingDrawing" xmlns:w10="urn:schemas-microsoft-com:office:word" xmlns:w="http://schemas.openxmlformats.org/wordprocessingml/2006/main" xmlns:w14="http://schemas.microsoft.com/office/word/2010/wordml" xmlns:w15="http://schemas.microsoft.com/office/word/2012/wordml" xmlns:w16cex="http://schemas.microsoft.com/office/word/2018/wordml/cex" xmlns:w16cid="http://schemas.microsoft.com/office/word/2016/wordml/cid" xmlns:w16="http://schemas.microsoft.com/office/word/2018/wordml" xmlns:w16sdtdh="http://schemas.microsoft.com/office/word/2020/wordml/sdtdatahash" xmlns:w16se="http://schemas.microsoft.com/office/word/2015/wordml/symex" xmlns:wpg="http://schemas.microsoft.com/office/word/2010/wordprocessingGroup" xmlns:wpi="http://schemas.microsoft.com/office/word/2010/wordprocessingInk" xmlns:wne="http://schemas.microsoft.com/office/word/2006/wordml" xmlns:wps="http://schemas.microsoft.com/office/word/2010/wordprocessingShape" mc:Ignorable="w14 w15 w16se w16cid w16 w16cex w16sdtdh wp14">
+<w:document xmlns:wpc="http://schemas.microsoft.com/office/word/2010/wordprocessingCanvas" xmlns:cx="http://schemas.microsoft.com/office/drawing/2014/chartex" xmlns:cx1="http://schemas.microsoft.com/office/drawing/2015/9/8/chartex" xmlns:cx2="http://schemas.microsoft.com/office/drawing/2015/10/21/chartex" xmlns:cx3="http://schemas.microsoft.com/office/drawing/2016/5/9/chartex" xmlns:cx4="http://schemas.microsoft.com/office/drawing/2016/5/10/chartex" xmlns:cx5="http://schemas.microsoft.com/office/drawing/2016/5/11/chartex" xmlns:cx6="http://schemas.microsoft.com/office/drawing/2016/5/12/chartex" xmlns:cx7="http://schemas.microsoft.com/office/drawing/2016/5/13/chartex" xmlns:cx8="http://schemas.microsoft.com/office/drawing/2016/5/14/chartex" xmlns:mc="http://schemas.openxmlformats.org/markup-compatibility/2006" xmlns:aink="http://schemas.microsoft.com/office/drawing/2016/ink" xmlns:am3d="http://schemas.microsoft.com/office/drawing/2017/model3d" xmlns:o="urn:schemas-microsoft-com:office:office" xmlns:oel="http://schemas.microsoft.com/office/2019/extlst" xmlns:r="http://schemas.openxmlformats.org/officeDocument/2006/relationships" xmlns:m="http://schemas.openxmlformats.org/officeDocument/2006/math" xmlns:v="urn:schemas-microsoft-com:vml" xmlns:wp14="http://schemas.microsoft.com/office/word/2010/wordprocessingDrawing" xmlns:wp="http://schemas.openxmlformats.org/drawingml/2006/wordprocessingDrawing" xmlns:w10="urn:schemas-microsoft-com:office:word" xmlns:w="http://schemas.openxmlformats.org/wordprocessingml/2006/main" xmlns:w14="http://schemas.microsoft.com/office/word/2010/wordml" xmlns:w15="http://schemas.microsoft.com/office/word/2012/wordml" xmlns:w16cex="http://schemas.microsoft.com/office/word/2018/wordml/cex" xmlns:w16cid="http://schemas.microsoft.com/office/word/2016/wordml/cid" xmlns:w16="http://schemas.microsoft.com/office/word/2018/wordml" xmlns:w16du="http://schemas.microsoft.com/office/word/2023/wordml/word16du" xmlns:w16sdtdh="http://schemas.microsoft.com/office/word/2020/wordml/sdtdatahash" xmlns:w16se="http://schemas.microsoft.com/office/word/2015/wordml/symex" xmlns:wpg="http://schemas.microsoft.com/office/word/2010/wordprocessingGroup" xmlns:wpi="http://schemas.microsoft.com/office/word/2010/wordprocessingInk" xmlns:wne="http://schemas.microsoft.com/office/word/2006/wordml" xmlns:wps="http://schemas.microsoft.com/office/word/2010/wordprocessingShape" mc:Ignorable="w14 w15 w16se w16cid w16 w16cex w16sdtdh w16du wp14">
   <w:body>
     <w:p>
       <w:pPr>
@@ -18,13 +18,8 @@
         </w:rPr>
       </w:pPr>
       <w:r>
-        <w:rPr>
-          <w:noProof/>
-        </w:rPr>
-      </w:r>
-      <w:r>
         <w:pict>
-          <v:roundrect id="Zone de texte 4" o:spid="_x0000_s2057" style="width:511.35pt;height:24.4pt;visibility:visible;mso-wrap-style:square;mso-left-percent:-10001;mso-top-percent:-10001;mso-position-horizontal:absolute;mso-position-horizontal-relative:char;mso-position-vertical:absolute;mso-position-vertical-relative:line;mso-left-percent:-10001;mso-top-percent:-10001;v-text-anchor:top" arcsize="10923f" o:gfxdata="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" fillcolor="#284475" strokecolor="#02466d" strokeweight="1pt">
+          <v:roundrect id="Zone de texte 4" o:spid="_x0000_s2060" style="width:511.35pt;height:24.4pt;visibility:visible;mso-wrap-style:square;mso-left-percent:-10001;mso-top-percent:-10001;mso-position-horizontal:absolute;mso-position-horizontal-relative:char;mso-position-vertical:absolute;mso-position-vertical-relative:line;mso-left-percent:-10001;mso-top-percent:-10001;v-text-anchor:top" arcsize="10923f" fillcolor="#284475" strokecolor="#02466d" strokeweight="1pt">
             <v:fill color2="#4472c4" angle="135" focus="100%" type="gradient">
               <o:fill v:ext="view" type="gradientUnscaled"/>
             </v:fill>
@@ -57,16 +52,7 @@
         </w:pict>
       </w:r>
     </w:p>
-    <w:p>
-      <w:r>
-        <w:rPr>
-          <w:rFonts w:ascii="Calibri" w:hAnsi="Calibri" w:cs="Calibri"/>
-          <w:sz w:val="20"/>
-          <w:szCs w:val="20"/>
-        </w:rPr>
-        <w:t xml:space="preserve"/>
-      </w:r>
-    </w:p>
+    <w:p/>
     <w:p>
       <w:pPr>
         <w:numPr>
@@ -80,19 +66,10 @@
           <w:sz w:val="20"/>
           <w:szCs w:val="20"/>
         </w:rPr>
-        <w:t xml:space="preserve">Pilotage de projets d’industrialisation d’électronique embarquée, incluant la définition de stratégies de contrôle réception et l’internalisation de procédés de moulage.</w:t>
-      </w:r>
-    </w:p>
-    <w:p>
-      <w:r>
-        <w:rPr>
-          <w:rFonts w:ascii="Calibri" w:hAnsi="Calibri" w:cs="Calibri"/>
-          <w:sz w:val="20"/>
-          <w:szCs w:val="20"/>
-        </w:rPr>
-        <w:t xml:space="preserve"/>
-      </w:r>
-    </w:p>
+        <w:t>Pilotage de projets d’industrialisation, notamment dans l’électronique embarquée, avec définition de stratégies de contrôle réception et internalisation de procédés.</w:t>
+      </w:r>
+    </w:p>
+    <w:p/>
     <w:p>
       <w:pPr>
         <w:numPr>
@@ -106,19 +83,10 @@
           <w:sz w:val="20"/>
           <w:szCs w:val="20"/>
         </w:rPr>
-        <w:t xml:space="preserve">Maîtrise des méthodes de résolution de problèmes (8D, QRQC, AMDEC) et des outils d’analyse statistique (SPC, Minitab, Cpk, Ppk) pour garantir la conformité et l’optimisation des processus.</w:t>
-      </w:r>
-    </w:p>
-    <w:p>
-      <w:r>
-        <w:rPr>
-          <w:rFonts w:ascii="Calibri" w:hAnsi="Calibri" w:cs="Calibri"/>
-          <w:sz w:val="20"/>
-          <w:szCs w:val="20"/>
-        </w:rPr>
-        <w:t xml:space="preserve"/>
-      </w:r>
-    </w:p>
+        <w:t>Maîtrise des méthodes qualité (8D, QRQC, AMDEC, Pareto, 5M) pour la résolution de problèmes complexes et la gestion des non‑conformités.</w:t>
+      </w:r>
+    </w:p>
+    <w:p/>
     <w:p>
       <w:pPr>
         <w:numPr>
@@ -132,19 +100,10 @@
           <w:sz w:val="20"/>
           <w:szCs w:val="20"/>
         </w:rPr>
-        <w:t xml:space="preserve">Gestion de la qualité fournisseur, élaboration et suivi de plans qualité fournisseurs (SPQ) ainsi que pilotage d’audits et mise en œuvre de plans d’actions correctives.</w:t>
-      </w:r>
-    </w:p>
-    <w:p>
-      <w:r>
-        <w:rPr>
-          <w:rFonts w:ascii="Calibri" w:hAnsi="Calibri" w:cs="Calibri"/>
-          <w:sz w:val="20"/>
-          <w:szCs w:val="20"/>
-        </w:rPr>
-        <w:t xml:space="preserve"/>
-      </w:r>
-    </w:p>
+        <w:t>Gestion de la qualité fournisseur : élaboration de plans qualité fournisseurs (SPQ), suivi d’audits, mise en œuvre de plans d’actions correctives et suivi des dérogations.</w:t>
+      </w:r>
+    </w:p>
+    <w:p/>
     <w:p>
       <w:pPr>
         <w:numPr>
@@ -158,19 +117,10 @@
           <w:sz w:val="20"/>
           <w:szCs w:val="20"/>
         </w:rPr>
-        <w:t xml:space="preserve">Qualification et validation des procédés et produits (IQ/OQ/PQ, FAI, VCV) et suivi de la conformité des livrables pour autoriser les livraisons clients.</w:t>
-      </w:r>
-    </w:p>
-    <w:p>
-      <w:r>
-        <w:rPr>
-          <w:rFonts w:ascii="Calibri" w:hAnsi="Calibri" w:cs="Calibri"/>
-          <w:sz w:val="20"/>
-          <w:szCs w:val="20"/>
-        </w:rPr>
-        <w:t xml:space="preserve"/>
-      </w:r>
-    </w:p>
+        <w:t>Qualification et validation des procédés et produits (IQ/OQ/PQ, FAI, VCV) ainsi que mise en place de plans de tests de vérification.</w:t>
+      </w:r>
+    </w:p>
+    <w:p/>
     <w:p>
       <w:pPr>
         <w:numPr>
@@ -184,19 +134,10 @@
           <w:sz w:val="20"/>
           <w:szCs w:val="20"/>
         </w:rPr>
-        <w:t xml:space="preserve">Conduite d’actions d’amélioration continue en utilisant les principes Lean Six Sigma, les plans d’expériences (DOE) et la mise en place de tableaux de bord Power BI.</w:t>
-      </w:r>
-    </w:p>
-    <w:p>
-      <w:r>
-        <w:rPr>
-          <w:rFonts w:ascii="Calibri" w:hAnsi="Calibri" w:cs="Calibri"/>
-          <w:sz w:val="20"/>
-          <w:szCs w:val="20"/>
-        </w:rPr>
-        <w:t xml:space="preserve"/>
-      </w:r>
-    </w:p>
+        <w:t>Amélioration continue et Lean Six Sigma (Yellow Belt) : conduite d’actions d’optimisation des processus via DOE, cartes de contrôle SPC et outils Lean.</w:t>
+      </w:r>
+    </w:p>
+    <w:p/>
     <w:p>
       <w:pPr>
         <w:numPr>
@@ -210,19 +151,10 @@
           <w:sz w:val="20"/>
           <w:szCs w:val="20"/>
         </w:rPr>
-        <w:t xml:space="preserve">Management d’équipes d’inspection, optimisation des processus d’inspection et gestion des dérogations ainsi que des dossiers qualité.</w:t>
-      </w:r>
-    </w:p>
-    <w:p>
-      <w:r>
-        <w:rPr>
-          <w:rFonts w:ascii="Calibri" w:hAnsi="Calibri" w:cs="Calibri"/>
-          <w:sz w:val="20"/>
-          <w:szCs w:val="20"/>
-        </w:rPr>
-        <w:t xml:space="preserve"/>
-      </w:r>
-    </w:p>
+        <w:t>Analyse statistique avancée avec Minitab, calcul de capabilités (Cpk, Ppk, RetR, RCR) et réalisation de plans d’expériences.</w:t>
+      </w:r>
+    </w:p>
+    <w:p/>
     <w:p>
       <w:pPr>
         <w:numPr>
@@ -236,33 +168,70 @@
           <w:sz w:val="20"/>
           <w:szCs w:val="20"/>
         </w:rPr>
-        <w:t xml:space="preserve">Utilisation avancée de SAP, Microsoft Project, Jira, Trello et des outils Office (Excel, Access, VBA, Word, PowerPoint) pour le pilotage, le reporting et l’automatisation des flux de données qualité.</w:t>
-      </w:r>
-    </w:p>
-    <w:p>
+        <w:t>Contrôle de la conformité des livrables, gestion des dossiers qualité, certificats de conformité et reporting de performances.</w:t>
+      </w:r>
+    </w:p>
+    <w:p/>
+    <w:p>
+      <w:pPr>
+        <w:numPr>
+          <w:ilvl w:val="0"/>
+          <w:numId w:val="6"/>
+        </w:numPr>
+      </w:pPr>
       <w:r>
         <w:rPr>
           <w:rFonts w:ascii="Calibri" w:hAnsi="Calibri" w:cs="Calibri"/>
           <w:sz w:val="20"/>
           <w:szCs w:val="20"/>
         </w:rPr>
-        <w:t xml:space="preserve"/>
-      </w:r>
-    </w:p>
-    <w:p>
-      <w:pPr>
-        <w:rPr>
-          <w:rFonts w:ascii="Calibri" w:hAnsi="Calibri"/>
-        </w:rPr>
-      </w:pPr>
-      <w:r>
-        <w:rPr>
-          <w:noProof/>
-        </w:rPr>
-      </w:r>
+        <w:t>Création de tableaux de bord et d’analyses décisionnelles avec Power BI pour le suivi des réclamations, incidents et indicateurs qualité.</w:t>
+      </w:r>
+    </w:p>
+    <w:p/>
+    <w:p>
+      <w:pPr>
+        <w:numPr>
+          <w:ilvl w:val="0"/>
+          <w:numId w:val="6"/>
+        </w:numPr>
+      </w:pPr>
+      <w:r>
+        <w:rPr>
+          <w:rFonts w:ascii="Calibri" w:hAnsi="Calibri" w:cs="Calibri"/>
+          <w:sz w:val="20"/>
+          <w:szCs w:val="20"/>
+        </w:rPr>
+        <w:t>Développement de bases de données et automatisation de tâches (Access, Excel, VBA) afin d’optimiser la gestion des produits périssables.</w:t>
+      </w:r>
+    </w:p>
+    <w:p/>
+    <w:p>
+      <w:pPr>
+        <w:numPr>
+          <w:ilvl w:val="0"/>
+          <w:numId w:val="6"/>
+        </w:numPr>
+      </w:pPr>
+      <w:r>
+        <w:rPr>
+          <w:rFonts w:ascii="Calibri" w:hAnsi="Calibri" w:cs="Calibri"/>
+          <w:sz w:val="20"/>
+          <w:szCs w:val="20"/>
+        </w:rPr>
+        <w:t>Utilisation d’outils de planification et de suivi de projets (SAP, Microsoft Project, Jira, Trello) pour le pilotage, la coordination d’équipes et le reporting.</w:t>
+      </w:r>
+    </w:p>
+    <w:p/>
+    <w:p>
+      <w:pPr>
+        <w:rPr>
+          <w:rFonts w:ascii="Calibri" w:hAnsi="Calibri"/>
+        </w:rPr>
+      </w:pPr>
       <w:r>
         <w:pict>
-          <v:roundrect id="Zone de texte 3" o:spid="_x0000_s2056" style="width:511.35pt;height:24.4pt;visibility:visible;mso-wrap-style:square;mso-left-percent:-10001;mso-top-percent:-10001;mso-position-horizontal:absolute;mso-position-horizontal-relative:char;mso-position-vertical:absolute;mso-position-vertical-relative:line;mso-left-percent:-10001;mso-top-percent:-10001;v-text-anchor:top" arcsize="10923f" o:gfxdata="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" fillcolor="#284475" strokecolor="#02466d" strokeweight="1pt">
+          <v:roundrect id="Zone de texte 3" o:spid="_x0000_s2059" style="width:511.35pt;height:24.4pt;visibility:visible;mso-wrap-style:square;mso-left-percent:-10001;mso-top-percent:-10001;mso-position-horizontal:absolute;mso-position-horizontal-relative:char;mso-position-vertical:absolute;mso-position-vertical-relative:line;mso-left-percent:-10001;mso-top-percent:-10001;v-text-anchor:top" arcsize="10923f" fillcolor="#284475" strokecolor="#02466d" strokeweight="1pt">
             <v:fill color2="#4472c4" angle="135" focus="100%" type="gradient">
               <o:fill v:ext="view" type="gradientUnscaled"/>
             </v:fill>
@@ -285,7 +254,7 @@
                       <w:b/>
                       <w:color w:val="FFFFFF"/>
                     </w:rPr>
-                    <w:t xml:space="preserve">OUTILS</w:t>
+                    <w:t>OUTILS</w:t>
                   </w:r>
                 </w:p>
               </w:txbxContent>
@@ -295,16 +264,7 @@
         </w:pict>
       </w:r>
     </w:p>
-    <w:p>
-      <w:r>
-        <w:rPr>
-          <w:rFonts w:ascii="Calibri" w:hAnsi="Calibri"/>
-          <w:sz w:val="20"/>
-          <w:szCs w:val="20"/>
-        </w:rPr>
-        <w:t xml:space="preserve"/>
-      </w:r>
-    </w:p>
+    <w:p/>
     <w:p>
       <w:pPr>
         <w:numPr>
@@ -320,27 +280,18 @@
           <w:sz w:val="20"/>
           <w:szCs w:val="20"/>
         </w:rPr>
-        <w:t xml:space="preserve">Méthodes et outils qualité:</w:t>
-      </w:r>
-      <w:r>
-        <w:rPr>
-          <w:rFonts w:ascii="Calibri" w:hAnsi="Calibri"/>
-          <w:sz w:val="20"/>
-          <w:szCs w:val="20"/>
-        </w:rPr>
-        <w:t xml:space="preserve"> 8D, QRQC, AMDEC, 5M, Pareto, SPC, MSP, DOE, Cpk, Ppk, RetR, RCR, FAI, IQ/OQ/PQ, VsV, VCV</w:t>
-      </w:r>
-    </w:p>
-    <w:p>
-      <w:r>
-        <w:rPr>
-          <w:rFonts w:ascii="Calibri" w:hAnsi="Calibri"/>
-          <w:sz w:val="20"/>
-          <w:szCs w:val="20"/>
-        </w:rPr>
-        <w:t xml:space="preserve"/>
-      </w:r>
-    </w:p>
+        <w:t>Gestion de projet:</w:t>
+      </w:r>
+      <w:r>
+        <w:rPr>
+          <w:rFonts w:ascii="Calibri" w:hAnsi="Calibri"/>
+          <w:sz w:val="20"/>
+          <w:szCs w:val="20"/>
+        </w:rPr>
+        <w:t xml:space="preserve"> Microsoft Project, Jira, Trello, SAP</w:t>
+      </w:r>
+    </w:p>
+    <w:p/>
     <w:p>
       <w:pPr>
         <w:numPr>
@@ -356,27 +307,18 @@
           <w:sz w:val="20"/>
           <w:szCs w:val="20"/>
         </w:rPr>
-        <w:t xml:space="preserve">Logiciels statistiques:</w:t>
-      </w:r>
-      <w:r>
-        <w:rPr>
-          <w:rFonts w:ascii="Calibri" w:hAnsi="Calibri"/>
-          <w:sz w:val="20"/>
-          <w:szCs w:val="20"/>
-        </w:rPr>
-        <w:t xml:space="preserve"> Minitab</w:t>
-      </w:r>
-    </w:p>
-    <w:p>
-      <w:r>
-        <w:rPr>
-          <w:rFonts w:ascii="Calibri" w:hAnsi="Calibri"/>
-          <w:sz w:val="20"/>
-          <w:szCs w:val="20"/>
-        </w:rPr>
-        <w:t xml:space="preserve"/>
-      </w:r>
-    </w:p>
+        <w:t>Qualité et amélioration continue:</w:t>
+      </w:r>
+      <w:r>
+        <w:rPr>
+          <w:rFonts w:ascii="Calibri" w:hAnsi="Calibri"/>
+          <w:sz w:val="20"/>
+          <w:szCs w:val="20"/>
+        </w:rPr>
+        <w:t xml:space="preserve"> Minitab, Power BI, Access, Excel, VBA</w:t>
+      </w:r>
+    </w:p>
+    <w:p/>
     <w:p>
       <w:pPr>
         <w:numPr>
@@ -392,27 +334,18 @@
           <w:sz w:val="20"/>
           <w:szCs w:val="20"/>
         </w:rPr>
-        <w:t xml:space="preserve">ERP et gestion de projet:</w:t>
-      </w:r>
-      <w:r>
-        <w:rPr>
-          <w:rFonts w:ascii="Calibri" w:hAnsi="Calibri"/>
-          <w:sz w:val="20"/>
-          <w:szCs w:val="20"/>
-        </w:rPr>
-        <w:t xml:space="preserve"> SAP, Microsoft Project, Jira, Trello</w:t>
-      </w:r>
-    </w:p>
-    <w:p>
-      <w:r>
-        <w:rPr>
-          <w:rFonts w:ascii="Calibri" w:hAnsi="Calibri"/>
-          <w:sz w:val="20"/>
-          <w:szCs w:val="20"/>
-        </w:rPr>
-        <w:t xml:space="preserve"/>
-      </w:r>
-    </w:p>
+        <w:t>Statistiques et analyse de données:</w:t>
+      </w:r>
+      <w:r>
+        <w:rPr>
+          <w:rFonts w:ascii="Calibri" w:hAnsi="Calibri"/>
+          <w:sz w:val="20"/>
+          <w:szCs w:val="20"/>
+        </w:rPr>
+        <w:t xml:space="preserve"> Minitab, SPC, DOE</w:t>
+      </w:r>
+    </w:p>
+    <w:p/>
     <w:p>
       <w:pPr>
         <w:numPr>
@@ -428,27 +361,18 @@
           <w:sz w:val="20"/>
           <w:szCs w:val="20"/>
         </w:rPr>
-        <w:t xml:space="preserve">Business Intelligence et automatisation:</w:t>
-      </w:r>
-      <w:r>
-        <w:rPr>
-          <w:rFonts w:ascii="Calibri" w:hAnsi="Calibri"/>
-          <w:sz w:val="20"/>
-          <w:szCs w:val="20"/>
-        </w:rPr>
-        <w:t xml:space="preserve"> Power BI, Access, Excel, VBA, Word, PowerPoint</w:t>
-      </w:r>
-    </w:p>
-    <w:p>
-      <w:r>
-        <w:rPr>
-          <w:rFonts w:ascii="Calibri" w:hAnsi="Calibri"/>
-          <w:sz w:val="20"/>
-          <w:szCs w:val="20"/>
-        </w:rPr>
-        <w:t xml:space="preserve"/>
-      </w:r>
-    </w:p>
+        <w:t>ERP et gestion de la production:</w:t>
+      </w:r>
+      <w:r>
+        <w:rPr>
+          <w:rFonts w:ascii="Calibri" w:hAnsi="Calibri"/>
+          <w:sz w:val="20"/>
+          <w:szCs w:val="20"/>
+        </w:rPr>
+        <w:t xml:space="preserve"> SAP</w:t>
+      </w:r>
+    </w:p>
+    <w:p/>
     <w:p>
       <w:pPr>
         <w:numPr>
@@ -464,27 +388,74 @@
           <w:sz w:val="20"/>
           <w:szCs w:val="20"/>
         </w:rPr>
-        <w:t xml:space="preserve">Normes et certifications:</w:t>
-      </w:r>
-      <w:r>
-        <w:rPr>
-          <w:rFonts w:ascii="Calibri" w:hAnsi="Calibri"/>
-          <w:sz w:val="20"/>
-          <w:szCs w:val="20"/>
-        </w:rPr>
-        <w:t xml:space="preserve"> Six Sigma Yellow Belt, IPC‑A‑610, Scrum Product Owner (CSPO), ISO 13485, ISO 14001, ISO G001, EN G100</w:t>
-      </w:r>
-    </w:p>
-    <w:p>
-      <w:r>
-        <w:rPr>
-          <w:rFonts w:ascii="Calibri" w:hAnsi="Calibri"/>
-          <w:sz w:val="20"/>
-          <w:szCs w:val="20"/>
-        </w:rPr>
-        <w:t xml:space="preserve"/>
-      </w:r>
-    </w:p>
+        <w:t>Bureautique:</w:t>
+      </w:r>
+      <w:r>
+        <w:rPr>
+          <w:rFonts w:ascii="Calibri" w:hAnsi="Calibri"/>
+          <w:sz w:val="20"/>
+          <w:szCs w:val="20"/>
+        </w:rPr>
+        <w:t xml:space="preserve"> Word, Excel, PowerPoint, Pack Office</w:t>
+      </w:r>
+    </w:p>
+    <w:p/>
+    <w:p>
+      <w:pPr>
+        <w:numPr>
+          <w:ilvl w:val="0"/>
+          <w:numId w:val="5"/>
+        </w:numPr>
+      </w:pPr>
+      <w:r>
+        <w:rPr>
+          <w:rFonts w:ascii="Calibri" w:hAnsi="Calibri"/>
+          <w:b/>
+          <w:bCs/>
+          <w:sz w:val="20"/>
+          <w:szCs w:val="20"/>
+        </w:rPr>
+        <w:t>Gestion de bases de données et automatisation:</w:t>
+      </w:r>
+      <w:r>
+        <w:rPr>
+          <w:rFonts w:ascii="Calibri" w:hAnsi="Calibri"/>
+          <w:sz w:val="20"/>
+          <w:szCs w:val="20"/>
+        </w:rPr>
+        <w:t xml:space="preserve"> Access, Excel, VBA</w:t>
+      </w:r>
+    </w:p>
+    <w:p/>
+    <w:p>
+      <w:pPr>
+        <w:numPr>
+          <w:ilvl w:val="0"/>
+          <w:numId w:val="5"/>
+        </w:numPr>
+      </w:pPr>
+      <w:r>
+        <w:rPr>
+          <w:rFonts w:ascii="Calibri" w:hAnsi="Calibri"/>
+          <w:b/>
+          <w:bCs/>
+          <w:sz w:val="20"/>
+          <w:szCs w:val="20"/>
+        </w:rPr>
+        <w:t>Reporting et visualisation:</w:t>
+      </w:r>
+      <w:r>
+        <w:rPr>
+          <w:rFonts w:ascii="Calibri" w:hAnsi="Calibri"/>
+          <w:sz w:val="20"/>
+          <w:szCs w:val="20"/>
+        </w:rPr>
+        <w:t xml:space="preserve"> Power BI</w:t>
+      </w:r>
+    </w:p>
+    <w:p/>
+    <w:p/>
+    <w:p/>
     <w:p>
       <w:pPr>
         <w:spacing w:after="19"/>
@@ -493,13 +464,8 @@
         </w:rPr>
       </w:pPr>
       <w:r>
-        <w:rPr>
-          <w:noProof/>
-        </w:rPr>
-      </w:r>
-      <w:r>
         <w:pict>
-          <v:roundrect id="Zone de texte 2" o:spid="_x0000_s2055" style="width:511.35pt;height:24.4pt;visibility:visible;mso-wrap-style:square;mso-left-percent:-10001;mso-top-percent:-10001;mso-position-horizontal:absolute;mso-position-horizontal-relative:char;mso-position-vertical:absolute;mso-position-vertical-relative:line;mso-left-percent:-10001;mso-top-percent:-10001;v-text-anchor:top" arcsize="10923f" o:gfxdata="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" fillcolor="#284475" strokecolor="#02466d" strokeweight="1pt">
+          <v:roundrect id="Zone de texte 2" o:spid="_x0000_s2058" style="width:511.35pt;height:24.4pt;visibility:visible;mso-wrap-style:square;mso-left-percent:-10001;mso-top-percent:-10001;mso-position-horizontal:absolute;mso-position-horizontal-relative:char;mso-position-vertical:absolute;mso-position-vertical-relative:line;mso-left-percent:-10001;mso-top-percent:-10001;v-text-anchor:top" arcsize="10923f" fillcolor="#284475" strokecolor="#02466d" strokeweight="1pt">
             <v:fill color2="#4472c4" angle="135" focus="100%" type="gradient">
               <o:fill v:ext="view" type="gradientUnscaled"/>
             </v:fill>
@@ -522,7 +488,7 @@
                       <w:b/>
                       <w:color w:val="FFFFFF"/>
                     </w:rPr>
-                    <w:t xml:space="preserve">SECTEURS D’ACTIVITÉ</w:t>
+                    <w:t>SECTEURS D’ACTIVITÉ</w:t>
                   </w:r>
                 </w:p>
               </w:txbxContent>
@@ -536,14 +502,6 @@
       <w:pPr>
         <w:spacing w:after="19"/>
       </w:pPr>
-      <w:r>
-        <w:rPr>
-          <w:rFonts w:ascii="Calibri" w:hAnsi="Calibri"/>
-          <w:sz w:val="20"/>
-          <w:szCs w:val="20"/>
-        </w:rPr>
-        <w:t xml:space="preserve"/>
-      </w:r>
     </w:p>
     <w:p>
       <w:pPr>
@@ -559,21 +517,13 @@
           <w:sz w:val="20"/>
           <w:szCs w:val="20"/>
         </w:rPr>
-        <w:t xml:space="preserve">Électronique embarquée</w:t>
+        <w:t>Dispositifs médicaux</w:t>
       </w:r>
     </w:p>
     <w:p>
       <w:pPr>
         <w:spacing w:after="19"/>
       </w:pPr>
-      <w:r>
-        <w:rPr>
-          <w:rFonts w:ascii="Calibri" w:hAnsi="Calibri"/>
-          <w:sz w:val="20"/>
-          <w:szCs w:val="20"/>
-        </w:rPr>
-        <w:t xml:space="preserve"/>
-      </w:r>
     </w:p>
     <w:p>
       <w:pPr>
@@ -589,21 +539,13 @@
           <w:sz w:val="20"/>
           <w:szCs w:val="20"/>
         </w:rPr>
-        <w:t xml:space="preserve">Équipements pétroliers</w:t>
+        <w:t>Énergie pétrolière</w:t>
       </w:r>
     </w:p>
     <w:p>
       <w:pPr>
         <w:spacing w:after="19"/>
       </w:pPr>
-      <w:r>
-        <w:rPr>
-          <w:rFonts w:ascii="Calibri" w:hAnsi="Calibri"/>
-          <w:sz w:val="20"/>
-          <w:szCs w:val="20"/>
-        </w:rPr>
-        <w:t xml:space="preserve"/>
-      </w:r>
     </w:p>
     <w:p>
       <w:pPr>
@@ -619,21 +561,13 @@
           <w:sz w:val="20"/>
           <w:szCs w:val="20"/>
         </w:rPr>
-        <w:t xml:space="preserve">Transport ferroviaire</w:t>
+        <w:t>Transport ferroviaire</w:t>
       </w:r>
     </w:p>
     <w:p>
       <w:pPr>
         <w:spacing w:after="19"/>
       </w:pPr>
-      <w:r>
-        <w:rPr>
-          <w:rFonts w:ascii="Calibri" w:hAnsi="Calibri"/>
-          <w:sz w:val="20"/>
-          <w:szCs w:val="20"/>
-        </w:rPr>
-        <w:t xml:space="preserve"/>
-      </w:r>
     </w:p>
     <w:p>
       <w:pPr>
@@ -649,36 +583,23 @@
           <w:sz w:val="20"/>
           <w:szCs w:val="20"/>
         </w:rPr>
-        <w:t xml:space="preserve">Dispositifs médicaux</w:t>
+        <w:t>Électronique</w:t>
       </w:r>
     </w:p>
     <w:p>
       <w:pPr>
         <w:spacing w:after="19"/>
       </w:pPr>
-      <w:r>
-        <w:rPr>
-          <w:rFonts w:ascii="Calibri" w:hAnsi="Calibri"/>
-          <w:sz w:val="20"/>
-          <w:szCs w:val="20"/>
-        </w:rPr>
-        <w:t xml:space="preserve"/>
-      </w:r>
-    </w:p>
-    <w:p>
-      <w:pPr>
-        <w:rPr>
-          <w:rFonts w:ascii="Calibri" w:hAnsi="Calibri"/>
-        </w:rPr>
-      </w:pPr>
-      <w:r>
-        <w:rPr>
-          <w:noProof/>
-        </w:rPr>
-      </w:r>
+    </w:p>
+    <w:p>
+      <w:pPr>
+        <w:rPr>
+          <w:rFonts w:ascii="Calibri" w:hAnsi="Calibri"/>
+        </w:rPr>
+      </w:pPr>
       <w:r>
         <w:pict>
-          <v:roundrect id="_x0000_s2054" style="width:511.35pt;height:24.4pt;visibility:visible;mso-wrap-style:square;mso-left-percent:-10001;mso-top-percent:-10001;mso-position-horizontal:absolute;mso-position-horizontal-relative:char;mso-position-vertical:absolute;mso-position-vertical-relative:line;mso-left-percent:-10001;mso-top-percent:-10001;v-text-anchor:top" arcsize="10923f" o:gfxdata="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" fillcolor="#284475" strokecolor="#02466d" strokeweight="1pt">
+          <v:roundrect id="_x0000_s2057" style="width:511.35pt;height:24.4pt;visibility:visible;mso-wrap-style:square;mso-left-percent:-10001;mso-top-percent:-10001;mso-position-horizontal:absolute;mso-position-horizontal-relative:char;mso-position-vertical:absolute;mso-position-vertical-relative:line;mso-left-percent:-10001;mso-top-percent:-10001;v-text-anchor:top" arcsize="10923f" fillcolor="#284475" strokecolor="#02466d" strokeweight="1pt">
             <v:fill color2="#4472c4" angle="135" focus="100%" type="gradient">
               <o:fill v:ext="view" type="gradientUnscaled"/>
             </v:fill>
@@ -701,7 +622,7 @@
                       <w:b/>
                       <w:color w:val="FFFFFF"/>
                     </w:rPr>
-                    <w:t xml:space="preserve">DIPLÔMES / FORMATION</w:t>
+                    <w:t>DIPLÔMES / FORMATION</w:t>
                   </w:r>
                 </w:p>
               </w:txbxContent>
@@ -718,90 +639,68 @@
           <w:sz w:val="20"/>
           <w:szCs w:val="20"/>
         </w:rPr>
-        <w:t xml:space="preserve">Master spécialisé Université d’Orléans — 2018-2020 Orléans</w:t>
-      </w:r>
-    </w:p>
-    <w:p>
-      <w:pPr>
-        <w:rPr>
-          <w:sz w:val="20"/>
-          <w:szCs w:val="20"/>
-        </w:rPr>
-      </w:pPr>
-    </w:p>
-    <w:p>
-      <w:r>
-        <w:rPr>
-          <w:rFonts w:ascii="Calibri" w:hAnsi="Calibri"/>
-          <w:sz w:val="20"/>
-          <w:szCs w:val="20"/>
-        </w:rPr>
-        <w:t xml:space="preserve">Diplôme d'ingénieur École Nationale Supérieure d'Ingénieurs de Bretagne Sud — 2010-2013 Lorient</w:t>
-      </w:r>
-    </w:p>
-    <w:p>
-      <w:pPr>
-        <w:rPr>
-          <w:sz w:val="20"/>
-          <w:szCs w:val="20"/>
-        </w:rPr>
-      </w:pPr>
-    </w:p>
-    <w:p>
-      <w:r>
-        <w:rPr>
-          <w:rFonts w:ascii="Calibri" w:hAnsi="Calibri"/>
-          <w:sz w:val="20"/>
-          <w:szCs w:val="20"/>
-        </w:rPr>
-        <w:t xml:space="preserve">Classes préparatoires aux grandes écoles (CPGE) Lycée César Baggio — 2007-2010</w:t>
-      </w:r>
-    </w:p>
-    <w:p>
-      <w:pPr>
-        <w:rPr>
-          <w:sz w:val="20"/>
-          <w:szCs w:val="20"/>
-        </w:rPr>
-      </w:pPr>
-    </w:p>
-    <w:p>
-      <w:r>
-        <w:rPr>
-          <w:rFonts w:ascii="Calibri" w:hAnsi="Calibri"/>
-          <w:sz w:val="20"/>
-          <w:szCs w:val="20"/>
-        </w:rPr>
-        <w:t xml:space="preserve"/>
-      </w:r>
-    </w:p>
-    <w:p>
-      <w:pPr>
-        <w:pStyle w:val="Corpsdetexte"/>
-      </w:pPr>
-      <w:r>
-        <w:rPr>
-          <w:rFonts w:ascii="Calibri" w:hAnsi="Calibri"/>
-          <w:sz w:val="20"/>
-          <w:szCs w:val="20"/>
-        </w:rPr>
-        <w:t xml:space="preserve"/>
-      </w:r>
-    </w:p>
-    <w:p>
-      <w:pPr>
-        <w:rPr>
-          <w:rFonts w:ascii="Calibri" w:hAnsi="Calibri"/>
-        </w:rPr>
-      </w:pPr>
-      <w:r>
-        <w:rPr>
-          <w:noProof/>
-        </w:rPr>
-      </w:r>
+        <w:t>Master spécialisé, Instrumentation, Contrôle et Management de la Performance des Systèmes Université d’Orléans — 2018-2020 Orléans</w:t>
+      </w:r>
+    </w:p>
+    <w:p>
+      <w:pPr>
+        <w:rPr>
+          <w:sz w:val="20"/>
+          <w:szCs w:val="20"/>
+        </w:rPr>
+      </w:pPr>
+    </w:p>
+    <w:p>
+      <w:r>
+        <w:rPr>
+          <w:rFonts w:ascii="Calibri" w:hAnsi="Calibri"/>
+          <w:sz w:val="20"/>
+          <w:szCs w:val="20"/>
+        </w:rPr>
+        <w:t>Diplôme d'ingénieur, Mécatronique École Nationale Supérieure d'Ingénieurs de Bretagne Sud — 2010-2013 Lorient</w:t>
+      </w:r>
+    </w:p>
+    <w:p>
+      <w:pPr>
+        <w:rPr>
+          <w:sz w:val="20"/>
+          <w:szCs w:val="20"/>
+        </w:rPr>
+      </w:pPr>
+    </w:p>
+    <w:p>
+      <w:r>
+        <w:rPr>
+          <w:rFonts w:ascii="Calibri" w:hAnsi="Calibri"/>
+          <w:sz w:val="20"/>
+          <w:szCs w:val="20"/>
+        </w:rPr>
+        <w:t>Classes préparatoires aux grandes écoles (CPGE) Lycée César Baggio — 2007-2010</w:t>
+      </w:r>
+    </w:p>
+    <w:p>
+      <w:pPr>
+        <w:rPr>
+          <w:sz w:val="20"/>
+          <w:szCs w:val="20"/>
+        </w:rPr>
+      </w:pPr>
+    </w:p>
+    <w:p/>
+    <w:p>
+      <w:pPr>
+        <w:pStyle w:val="Corpsdetexte"/>
+      </w:pPr>
+    </w:p>
+    <w:p>
+      <w:pPr>
+        <w:rPr>
+          <w:rFonts w:ascii="Calibri" w:hAnsi="Calibri"/>
+        </w:rPr>
+      </w:pPr>
       <w:r>
         <w:pict>
-          <v:roundrect id="_x0000_s2053" style="width:511.35pt;height:24.4pt;visibility:visible;mso-wrap-style:square;mso-left-percent:-10001;mso-top-percent:-10001;mso-position-horizontal:absolute;mso-position-horizontal-relative:char;mso-position-vertical:absolute;mso-position-vertical-relative:line;mso-left-percent:-10001;mso-top-percent:-10001;v-text-anchor:top" arcsize="10923f" o:gfxdata="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" fillcolor="#284475" strokecolor="#02466d" strokeweight="1pt">
+          <v:roundrect id="_x0000_s2056" style="width:511.35pt;height:24.4pt;visibility:visible;mso-wrap-style:square;mso-left-percent:-10001;mso-top-percent:-10001;mso-position-horizontal:absolute;mso-position-horizontal-relative:char;mso-position-vertical:absolute;mso-position-vertical-relative:line;mso-left-percent:-10001;mso-top-percent:-10001;v-text-anchor:top" arcsize="10923f" fillcolor="#284475" strokecolor="#02466d" strokeweight="1pt">
             <v:fill color2="#4472c4" angle="135" focus="100%" type="gradient">
               <o:fill v:ext="view" type="gradientUnscaled"/>
             </v:fill>
@@ -824,7 +723,7 @@
                       <w:b/>
                       <w:color w:val="FFFFFF"/>
                     </w:rPr>
-                    <w:t xml:space="preserve">LANGUES</w:t>
+                    <w:t>LANGUES</w:t>
                   </w:r>
                 </w:p>
               </w:txbxContent>
@@ -834,16 +733,7 @@
         </w:pict>
       </w:r>
     </w:p>
-    <w:p>
-      <w:r>
-        <w:rPr>
-          <w:rFonts w:ascii="Calibri" w:hAnsi="Calibri"/>
-          <w:sz w:val="20"/>
-          <w:szCs w:val="20"/>
-        </w:rPr>
-        <w:t xml:space="preserve"/>
-      </w:r>
-    </w:p>
+    <w:p/>
     <w:p>
       <w:pPr>
         <w:numPr>
@@ -857,50 +747,28 @@
           <w:sz w:val="20"/>
           <w:szCs w:val="20"/>
         </w:rPr>
-        <w:t xml:space="preserve">Anglais (C1)</w:t>
-      </w:r>
-    </w:p>
-    <w:p>
-      <w:r>
-        <w:rPr>
-          <w:rFonts w:ascii="Calibri" w:hAnsi="Calibri"/>
-          <w:sz w:val="20"/>
-          <w:szCs w:val="20"/>
-        </w:rPr>
-        <w:t xml:space="preserve"/>
-      </w:r>
-    </w:p>
-    <w:p>
-      <w:pPr>
-        <w:pStyle w:val="Corpsdetexte"/>
-        <w:rPr>
-          <w:sz w:val="20"/>
-          <w:szCs w:val="20"/>
-        </w:rPr>
-      </w:pPr>
-      <w:r>
-        <w:rPr>
-          <w:rFonts w:ascii="Calibri" w:hAnsi="Calibri" w:cs="Calibri"/>
-          <w:sz w:val="20"/>
-          <w:szCs w:val="20"/>
-        </w:rPr>
-        <w:t xml:space="preserve"/>
-      </w:r>
-    </w:p>
-    <w:p>
-      <w:pPr>
-        <w:rPr>
-          <w:rFonts w:ascii="Calibri" w:hAnsi="Calibri"/>
-        </w:rPr>
-      </w:pPr>
-      <w:r>
-        <w:rPr>
-          <w:noProof/>
-        </w:rPr>
-      </w:r>
+        <w:t>Anglais - C1</w:t>
+      </w:r>
+    </w:p>
+    <w:p/>
+    <w:p>
+      <w:pPr>
+        <w:pStyle w:val="Corpsdetexte"/>
+        <w:rPr>
+          <w:sz w:val="20"/>
+          <w:szCs w:val="20"/>
+        </w:rPr>
+      </w:pPr>
+    </w:p>
+    <w:p>
+      <w:pPr>
+        <w:rPr>
+          <w:rFonts w:ascii="Calibri" w:hAnsi="Calibri"/>
+        </w:rPr>
+      </w:pPr>
       <w:r>
         <w:pict>
-          <v:roundrect id="Zone de texte 1" o:spid="_x0000_s2052" style="width:511.35pt;height:24.4pt;visibility:visible;mso-wrap-style:square;mso-left-percent:-10001;mso-top-percent:-10001;mso-position-horizontal:absolute;mso-position-horizontal-relative:char;mso-position-vertical:absolute;mso-position-vertical-relative:line;mso-left-percent:-10001;mso-top-percent:-10001;v-text-anchor:top" arcsize="10923f" o:gfxdata="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" fillcolor="#284475" strokecolor="#02466d" strokeweight="1pt">
+          <v:roundrect id="Zone de texte 1" o:spid="_x0000_s2055" style="width:511.35pt;height:24.4pt;visibility:visible;mso-wrap-style:square;mso-left-percent:-10001;mso-top-percent:-10001;mso-position-horizontal:absolute;mso-position-horizontal-relative:char;mso-position-vertical:absolute;mso-position-vertical-relative:line;mso-left-percent:-10001;mso-top-percent:-10001;v-text-anchor:top" arcsize="10923f" fillcolor="#284475" strokecolor="#02466d" strokeweight="1pt">
             <v:fill color2="#4472c4" angle="135" focus="100%" type="gradient">
               <o:fill v:ext="view" type="gradientUnscaled"/>
             </v:fill>
@@ -923,7 +791,7 @@
                       <w:b/>
                       <w:color w:val="FFFFFF"/>
                     </w:rPr>
-                    <w:t xml:space="preserve">EXPÉRIENCES PROFESSIONNELLES</w:t>
+                    <w:t>EXPÉRIENCES PROFESSIONNELLES</w:t>
                   </w:r>
                 </w:p>
               </w:txbxContent>
@@ -943,15 +811,7 @@
           <w:sz w:val="20"/>
           <w:szCs w:val="20"/>
         </w:rPr>
-        <w:t xml:space="preserve"/>
-      </w:r>
-      <w:r>
-        <w:rPr>
-          <w:rFonts w:ascii="Calibri" w:hAnsi="Calibri" w:cs="Calibri"/>
-          <w:sz w:val="20"/>
-          <w:szCs w:val="20"/>
-        </w:rPr>
-        <w:t xml:space="preserve">SCHLUMBERGER - Équipements pétroliers 02/2022 – 01/2025 2 ans 11 mois</w:t>
+        <w:t>CARMAT – Cœur artificiel 09/2021 - Actuel 2 ans et 6 mois</w:t>
       </w:r>
     </w:p>
     <w:p>
@@ -968,7 +828,7 @@
           <w:noProof/>
         </w:rPr>
         <w:pict>
-          <v:line id="Ligne 1" o:spid="_x0000_s2051" style="position:absolute;z-index:19;visibility:visible;mso-wrap-style:square;mso-wrap-distance-left:.05pt;mso-wrap-distance-top:.05pt;mso-wrap-distance-right:.05pt;mso-wrap-distance-bottom:.05pt;mso-position-horizontal:absolute;mso-position-horizontal-relative:text;mso-position-vertical:absolute;mso-position-vertical-relative:text" from="5.7pt,-1.25pt" to="517.55pt,-.6pt" o:gfxdata="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" strokecolor="#3465a4" strokeweight="0"/>
+          <v:line id="Ligne 1" o:spid="_x0000_s2051" style="position:absolute;z-index:251653120;visibility:visible;mso-wrap-style:square;mso-wrap-distance-left:.05pt;mso-wrap-distance-top:.05pt;mso-wrap-distance-right:.05pt;mso-wrap-distance-bottom:.05pt;mso-position-horizontal:absolute;mso-position-horizontal-relative:text;mso-position-vertical:absolute;mso-position-vertical-relative:text" from="5.7pt,-1.25pt" to="517.55pt,-.6pt" o:gfxdata="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" strokecolor="#3465a4" strokeweight="0"/>
         </w:pict>
       </w:r>
     </w:p>
@@ -988,48 +848,197 @@
           <w:sz w:val="20"/>
           <w:szCs w:val="20"/>
         </w:rPr>
-        <w:t xml:space="preserve">Ingénieur qualité produit – Produits électroniques</w:t>
-      </w:r>
-    </w:p>
-    <w:p>
-      <w:pPr>
-        <w:pStyle w:val="Corpsdetexte"/>
-      </w:pPr>
-      <w:r>
-        <w:rPr>
-          <w:rFonts w:ascii="Calibri" w:hAnsi="Calibri"/>
-          <w:sz w:val="20"/>
-          <w:szCs w:val="20"/>
-        </w:rPr>
-        <w:t xml:space="preserve"/>
-      </w:r>
-    </w:p>
-    <w:p>
-      <w:pPr>
-        <w:pStyle w:val="Corpsdetexte"/>
-        <w:rPr>
-          <w:rFonts w:ascii="Calibri" w:hAnsi="Calibri"/>
-        </w:rPr>
-      </w:pPr>
-      <w:r>
-        <w:rPr>
-          <w:rFonts w:ascii="Calibri" w:hAnsi="Calibri"/>
-        </w:rPr>
-        <w:t xml:space="preserve">- Gestion des non‑conformités : identification des causes racines, sécurisation, définition et suivi du plan d'actions correctives, évaluation de l'efficacité des actions mises en œuvre et réalisation du retour d'expérience (REX). - Traitement des réclamations clients : résolution de problèmes en appliquant les méthodologies 8D et QRQC. - Mise à jour des plans de contrôle. - Contrôle de la conformité des livrables afin d’autoriser la livraison au client. - Audit interne : planification, préparation, exécution, communication des résultats et suivi du plan d’actions. - Élaboration et mise en œuvre de plans d’amélioration continue. - Gestion de l’équipe inspection. - Gestion et optimisation du processus d’inspection. - Validation des plans de tests de vérification et validation (VCV). - Gestion des dérogations. - Gestion des dossiers qualité et des certificats de conformité. - Utilisation de Power BI pour créer des tableaux de bord d’analyse des réclamations, des RAN et des incidents internes. </w:t>
-      </w:r>
-    </w:p>
-    <w:p>
-      <w:pPr>
-        <w:pStyle w:val="Corpsdetexte"/>
-      </w:pPr>
-      <w:r>
-        <w:rPr>
-          <w:rFonts w:ascii="Calibri" w:hAnsi="Calibri"/>
-          <w:sz w:val="20"/>
-          <w:szCs w:val="20"/>
-        </w:rPr>
-        <w:t xml:space="preserve"/>
-      </w:r>
+        <w:t>Chef de projet industrialisation/Qualité fournisseur - Cartes électroniques</w:t>
+      </w:r>
+    </w:p>
+    <w:p>
+      <w:pPr>
+        <w:pStyle w:val="Corpsdetexte"/>
+      </w:pPr>
+    </w:p>
+    <w:p>
+      <w:pPr>
+        <w:pStyle w:val="Corpsdetexte"/>
+        <w:rPr>
+          <w:rFonts w:ascii="Calibri" w:hAnsi="Calibri"/>
+          <w:sz w:val="20"/>
+          <w:szCs w:val="20"/>
+        </w:rPr>
+      </w:pPr>
+      <w:r>
+        <w:rPr>
+          <w:rFonts w:ascii="Calibri" w:hAnsi="Calibri"/>
+          <w:sz w:val="20"/>
+          <w:szCs w:val="20"/>
+        </w:rPr>
+        <w:t>- Définition de la stratégie de contrôle à la réception</w:t>
+      </w:r>
+    </w:p>
+    <w:p>
+      <w:pPr>
+        <w:pStyle w:val="Corpsdetexte"/>
+        <w:rPr>
+          <w:rFonts w:ascii="Calibri" w:hAnsi="Calibri"/>
+          <w:sz w:val="20"/>
+          <w:szCs w:val="20"/>
+        </w:rPr>
+      </w:pPr>
+      <w:r>
+        <w:rPr>
+          <w:rFonts w:ascii="Calibri" w:hAnsi="Calibri"/>
+          <w:sz w:val="20"/>
+          <w:szCs w:val="20"/>
+        </w:rPr>
+        <w:t>- Conception et déploiement du plan qualité fournisseur (SPQ)</w:t>
+      </w:r>
+    </w:p>
+    <w:p>
+      <w:pPr>
+        <w:pStyle w:val="Corpsdetexte"/>
+        <w:rPr>
+          <w:rFonts w:ascii="Calibri" w:hAnsi="Calibri"/>
+          <w:sz w:val="20"/>
+          <w:szCs w:val="20"/>
+        </w:rPr>
+      </w:pPr>
+      <w:r>
+        <w:rPr>
+          <w:rFonts w:ascii="Calibri" w:hAnsi="Calibri"/>
+          <w:sz w:val="20"/>
+          <w:szCs w:val="20"/>
+        </w:rPr>
+        <w:t>- Analyse statistique (SPS, Cpk, Ppk, RCR) pour la validation des procédés spéciaux</w:t>
+      </w:r>
+    </w:p>
+    <w:p>
+      <w:pPr>
+        <w:pStyle w:val="Corpsdetexte"/>
+        <w:rPr>
+          <w:rFonts w:ascii="Calibri" w:hAnsi="Calibri"/>
+          <w:sz w:val="20"/>
+          <w:szCs w:val="20"/>
+        </w:rPr>
+      </w:pPr>
+      <w:r>
+        <w:rPr>
+          <w:rFonts w:ascii="Calibri" w:hAnsi="Calibri"/>
+          <w:sz w:val="20"/>
+          <w:szCs w:val="20"/>
+        </w:rPr>
+        <w:t>- Qualification des installations (IQ/OQ/PQ) et des moyens de production</w:t>
+      </w:r>
+    </w:p>
+    <w:p>
+      <w:pPr>
+        <w:pStyle w:val="Corpsdetexte"/>
+        <w:rPr>
+          <w:rFonts w:ascii="Calibri" w:hAnsi="Calibri"/>
+          <w:sz w:val="20"/>
+          <w:szCs w:val="20"/>
+        </w:rPr>
+      </w:pPr>
+      <w:r>
+        <w:rPr>
+          <w:rFonts w:ascii="Calibri" w:hAnsi="Calibri"/>
+          <w:sz w:val="20"/>
+          <w:szCs w:val="20"/>
+        </w:rPr>
+        <w:t>- Suivi et validation des FAI avec les fournisseurs</w:t>
+      </w:r>
+    </w:p>
+    <w:p>
+      <w:pPr>
+        <w:pStyle w:val="Corpsdetexte"/>
+        <w:rPr>
+          <w:rFonts w:ascii="Calibri" w:hAnsi="Calibri"/>
+          <w:sz w:val="20"/>
+          <w:szCs w:val="20"/>
+        </w:rPr>
+      </w:pPr>
+      <w:r>
+        <w:rPr>
+          <w:rFonts w:ascii="Calibri" w:hAnsi="Calibri"/>
+          <w:sz w:val="20"/>
+          <w:szCs w:val="20"/>
+        </w:rPr>
+        <w:t>- Chef de projet : internalisation du procédé de moulage des cartes électroniques</w:t>
+      </w:r>
+    </w:p>
+    <w:p>
+      <w:pPr>
+        <w:pStyle w:val="Corpsdetexte"/>
+        <w:rPr>
+          <w:rFonts w:ascii="Calibri" w:hAnsi="Calibri"/>
+          <w:sz w:val="20"/>
+          <w:szCs w:val="20"/>
+        </w:rPr>
+      </w:pPr>
+      <w:r>
+        <w:rPr>
+          <w:rFonts w:ascii="Calibri" w:hAnsi="Calibri"/>
+          <w:sz w:val="20"/>
+          <w:szCs w:val="20"/>
+        </w:rPr>
+        <w:t>- Validation des plans de tests de vérification et de validation (VCV)</w:t>
+      </w:r>
+    </w:p>
+    <w:p>
+      <w:pPr>
+        <w:pStyle w:val="Corpsdetexte"/>
+        <w:rPr>
+          <w:rFonts w:ascii="Calibri" w:hAnsi="Calibri"/>
+          <w:sz w:val="20"/>
+          <w:szCs w:val="20"/>
+        </w:rPr>
+      </w:pPr>
+      <w:r>
+        <w:rPr>
+          <w:rFonts w:ascii="Calibri" w:hAnsi="Calibri"/>
+          <w:sz w:val="20"/>
+          <w:szCs w:val="20"/>
+        </w:rPr>
+        <w:t>- Pilotage des audits fournisseurs et suivi du plan d’actions</w:t>
+      </w:r>
+    </w:p>
+    <w:p>
+      <w:pPr>
+        <w:pStyle w:val="Corpsdetexte"/>
+        <w:rPr>
+          <w:rFonts w:ascii="Calibri" w:hAnsi="Calibri"/>
+          <w:sz w:val="20"/>
+          <w:szCs w:val="20"/>
+        </w:rPr>
+      </w:pPr>
+    </w:p>
+    <w:p>
+      <w:pPr>
+        <w:pStyle w:val="Corpsdetexte"/>
+        <w:rPr>
+          <w:rFonts w:ascii="Calibri" w:hAnsi="Calibri"/>
+          <w:sz w:val="20"/>
+          <w:szCs w:val="20"/>
+        </w:rPr>
+      </w:pPr>
+    </w:p>
+    <w:p>
+      <w:pPr>
+        <w:pStyle w:val="Corpsdetexte"/>
+        <w:rPr>
+          <w:rFonts w:ascii="Calibri" w:hAnsi="Calibri"/>
+          <w:sz w:val="20"/>
+          <w:szCs w:val="20"/>
+        </w:rPr>
+      </w:pPr>
+    </w:p>
+    <w:p>
+      <w:pPr>
+        <w:pStyle w:val="Corpsdetexte"/>
+        <w:rPr>
+          <w:rFonts w:ascii="Calibri" w:hAnsi="Calibri"/>
+          <w:sz w:val="20"/>
+          <w:szCs w:val="20"/>
+        </w:rPr>
+      </w:pPr>
     </w:p>
     <w:p>
       <w:pPr>
@@ -1041,44 +1050,7 @@
           <w:sz w:val="20"/>
           <w:szCs w:val="20"/>
         </w:rPr>
-        <w:t xml:space="preserve"/>
-      </w:r>
-    </w:p>
-    <w:p>
-      <w:pPr>
-        <w:pStyle w:val="Corpsdetexte"/>
-      </w:pPr>
-      <w:r>
-        <w:rPr>
-          <w:rFonts w:ascii="Calibri" w:hAnsi="Calibri" w:cs="Calibri"/>
-          <w:b/>
-          <w:bCs/>
-          <w:sz w:val="20"/>
-          <w:szCs w:val="20"/>
-        </w:rPr>
-        <w:t xml:space="preserve">Outils:</w:t>
-      </w:r>
-      <w:r>
-        <w:rPr>
-          <w:rFonts w:ascii="Calibri" w:hAnsi="Calibri" w:cs="Calibri"/>
-          <w:sz w:val="20"/>
-          <w:szCs w:val="20"/>
-        </w:rPr>
-        <w:t xml:space="preserve"> Power BI</w:t>
-      </w:r>
-      <w:r>
-        <w:rPr>
-          <w:rFonts w:ascii="Calibri" w:hAnsi="Calibri"/>
-        </w:rPr>
-        <w:t xml:space="preserve"/>
-      </w:r>
-      <w:r>
-        <w:rPr>
-          <w:rFonts w:ascii="Calibri" w:hAnsi="Calibri" w:cs="Calibri"/>
-          <w:sz w:val="20"/>
-          <w:szCs w:val="20"/>
-        </w:rPr>
-        <w:t xml:space="preserve">CARMAT – Cœur artificiel 09/2021 – Actuel 2 ans 6 mois</w:t>
+        <w:t>SCHLUMBERGER - Équipements pétroliers 02/2022 – 01/2025 2 ans 11 mois</w:t>
       </w:r>
     </w:p>
     <w:p>
@@ -1095,7 +1067,7 @@
           <w:noProof/>
         </w:rPr>
         <w:pict>
-          <v:line id="Ligne 1" o:spid="_x0000_s2051" style="position:absolute;z-index:19;visibility:visible;mso-wrap-style:square;mso-wrap-distance-left:.05pt;mso-wrap-distance-top:.05pt;mso-wrap-distance-right:.05pt;mso-wrap-distance-bottom:.05pt;mso-position-horizontal:absolute;mso-position-horizontal-relative:text;mso-position-vertical:absolute;mso-position-vertical-relative:text" from="5.7pt,-1.25pt" to="517.55pt,-.6pt" o:gfxdata="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" strokecolor="#3465a4" strokeweight="0"/>
+          <v:line id="_x0000_s2054" style="position:absolute;z-index:251654144;visibility:visible;mso-wrap-style:square;mso-wrap-distance-left:.05pt;mso-wrap-distance-top:.05pt;mso-wrap-distance-right:.05pt;mso-wrap-distance-bottom:.05pt;mso-position-horizontal:absolute;mso-position-horizontal-relative:text;mso-position-vertical:absolute;mso-position-vertical-relative:text" from="5.7pt,-1.25pt" to="517.55pt,-.6pt" o:gfxdata="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" strokecolor="#3465a4" strokeweight="0"/>
         </w:pict>
       </w:r>
     </w:p>
@@ -1115,74 +1087,314 @@
           <w:sz w:val="20"/>
           <w:szCs w:val="20"/>
         </w:rPr>
-        <w:t xml:space="preserve">Chef de projet industrialisation/Qualité fournisseur - Cartes électroniques</w:t>
-      </w:r>
-    </w:p>
-    <w:p>
-      <w:pPr>
-        <w:pStyle w:val="Corpsdetexte"/>
-      </w:pPr>
-      <w:r>
-        <w:rPr>
-          <w:rFonts w:ascii="Calibri" w:hAnsi="Calibri"/>
-          <w:sz w:val="20"/>
-          <w:szCs w:val="20"/>
-        </w:rPr>
-        <w:t xml:space="preserve"/>
-      </w:r>
-    </w:p>
-    <w:p>
-      <w:pPr>
-        <w:pStyle w:val="Corpsdetexte"/>
-        <w:rPr>
-          <w:rFonts w:ascii="Calibri" w:hAnsi="Calibri"/>
-        </w:rPr>
-      </w:pPr>
-      <w:r>
-        <w:rPr>
-          <w:rFonts w:ascii="Calibri" w:hAnsi="Calibri"/>
-        </w:rPr>
-        <w:t xml:space="preserve">- Définition de la stratégie de contrôle à la réception. - Conception et déploiement du plan qualité fournisseur (SPQ). - Analyse statistique (SPS, Cpk, Ppk, RCR) pour la validation des procédés spéciaux. - Qualification des installations (IQ/OQ/PQ) et des moyens de production. - Suivi et validation des First Article Inspections (FAI) avec les fournisseurs. - Chef de projet de l’internalisation du procédé de moulage des cartes électroniques. - Validation des plans de tests de vérification et validation (VCV). - Pilotage des audits fournisseurs et suivi du plan d’actions. </w:t>
-      </w:r>
-    </w:p>
-    <w:p>
-      <w:pPr>
-        <w:pStyle w:val="Corpsdetexte"/>
-      </w:pPr>
-      <w:r>
-        <w:rPr>
-          <w:rFonts w:ascii="Calibri" w:hAnsi="Calibri"/>
-          <w:sz w:val="20"/>
-          <w:szCs w:val="20"/>
-        </w:rPr>
-        <w:t xml:space="preserve"/>
-      </w:r>
-    </w:p>
-    <w:p>
-      <w:pPr>
-        <w:pStyle w:val="Corpsdetexte"/>
-      </w:pPr>
-      <w:r>
+        <w:t>Ingénieur qualité produit – Produits électroniques</w:t>
+      </w:r>
+    </w:p>
+    <w:p>
+      <w:pPr>
+        <w:pStyle w:val="Corpsdetexte"/>
+      </w:pPr>
+    </w:p>
+    <w:p>
+      <w:pPr>
+        <w:pStyle w:val="Corpsdetexte"/>
+        <w:rPr>
+          <w:rFonts w:ascii="Calibri" w:hAnsi="Calibri"/>
+          <w:sz w:val="20"/>
+          <w:szCs w:val="20"/>
+        </w:rPr>
+      </w:pPr>
+      <w:r>
+        <w:rPr>
+          <w:rFonts w:ascii="Calibri" w:hAnsi="Calibri"/>
+          <w:sz w:val="20"/>
+          <w:szCs w:val="20"/>
+        </w:rPr>
+        <w:t>- Gestion des non‑conformités : identification des causes racines, sécurisation, définition et suivi du plan d’actions correctives, évaluation de l’efficacité des actions mises en œuvre et réalisation du retour d’expérience (REX)</w:t>
+      </w:r>
+    </w:p>
+    <w:p>
+      <w:pPr>
+        <w:pStyle w:val="Corpsdetexte"/>
+        <w:rPr>
+          <w:rFonts w:ascii="Calibri" w:hAnsi="Calibri"/>
+          <w:sz w:val="20"/>
+          <w:szCs w:val="20"/>
+        </w:rPr>
+      </w:pPr>
+      <w:r>
+        <w:rPr>
+          <w:rFonts w:ascii="Calibri" w:hAnsi="Calibri"/>
+          <w:sz w:val="20"/>
+          <w:szCs w:val="20"/>
+        </w:rPr>
+        <w:t>- Traitement des réclamations clients (résolution de problèmes, 8D, QRQC)</w:t>
+      </w:r>
+    </w:p>
+    <w:p>
+      <w:pPr>
+        <w:pStyle w:val="Corpsdetexte"/>
+        <w:rPr>
+          <w:rFonts w:ascii="Calibri" w:hAnsi="Calibri"/>
+          <w:sz w:val="20"/>
+          <w:szCs w:val="20"/>
+        </w:rPr>
+      </w:pPr>
+      <w:r>
+        <w:rPr>
+          <w:rFonts w:ascii="Calibri" w:hAnsi="Calibri"/>
+          <w:sz w:val="20"/>
+          <w:szCs w:val="20"/>
+        </w:rPr>
+        <w:t>- Mise à jour des plans de contrôle</w:t>
+      </w:r>
+    </w:p>
+    <w:p>
+      <w:pPr>
+        <w:pStyle w:val="Corpsdetexte"/>
+        <w:rPr>
+          <w:rFonts w:ascii="Calibri" w:hAnsi="Calibri"/>
+          <w:sz w:val="20"/>
+          <w:szCs w:val="20"/>
+        </w:rPr>
+      </w:pPr>
+      <w:r>
+        <w:rPr>
+          <w:rFonts w:ascii="Calibri" w:hAnsi="Calibri"/>
+          <w:sz w:val="20"/>
+          <w:szCs w:val="20"/>
+        </w:rPr>
+        <w:t>- Contrôle de la conformité des livrables pour autoriser la livraison au client</w:t>
+      </w:r>
+    </w:p>
+    <w:p>
+      <w:pPr>
+        <w:pStyle w:val="Corpsdetexte"/>
+        <w:rPr>
+          <w:rFonts w:ascii="Calibri" w:hAnsi="Calibri"/>
+          <w:sz w:val="20"/>
+          <w:szCs w:val="20"/>
+        </w:rPr>
+      </w:pPr>
+      <w:r>
+        <w:rPr>
+          <w:rFonts w:ascii="Calibri" w:hAnsi="Calibri"/>
+          <w:sz w:val="20"/>
+          <w:szCs w:val="20"/>
+        </w:rPr>
+        <w:t>- Audit interne : planification, préparation, exécution, communication des résultats et suivi du plan d’actions</w:t>
+      </w:r>
+    </w:p>
+    <w:p>
+      <w:pPr>
+        <w:pStyle w:val="Corpsdetexte"/>
+        <w:rPr>
+          <w:rFonts w:ascii="Calibri" w:hAnsi="Calibri"/>
+          <w:sz w:val="20"/>
+          <w:szCs w:val="20"/>
+        </w:rPr>
+      </w:pPr>
+      <w:r>
+        <w:rPr>
+          <w:rFonts w:ascii="Calibri" w:hAnsi="Calibri"/>
+          <w:sz w:val="20"/>
+          <w:szCs w:val="20"/>
+        </w:rPr>
+        <w:t>- Élaboration et mise en œuvre des plans d’amélioration continue</w:t>
+      </w:r>
+    </w:p>
+    <w:p>
+      <w:pPr>
+        <w:pStyle w:val="Corpsdetexte"/>
+        <w:rPr>
+          <w:rFonts w:ascii="Calibri" w:hAnsi="Calibri"/>
+          <w:sz w:val="20"/>
+          <w:szCs w:val="20"/>
+        </w:rPr>
+      </w:pPr>
+      <w:r>
+        <w:rPr>
+          <w:rFonts w:ascii="Calibri" w:hAnsi="Calibri"/>
+          <w:sz w:val="20"/>
+          <w:szCs w:val="20"/>
+        </w:rPr>
+        <w:t>- Gestion de l’équipe d’inspection</w:t>
+      </w:r>
+    </w:p>
+    <w:p>
+      <w:pPr>
+        <w:pStyle w:val="Corpsdetexte"/>
+        <w:rPr>
+          <w:rFonts w:ascii="Calibri" w:hAnsi="Calibri"/>
+          <w:sz w:val="20"/>
+          <w:szCs w:val="20"/>
+        </w:rPr>
+      </w:pPr>
+      <w:r>
+        <w:rPr>
+          <w:rFonts w:ascii="Calibri" w:hAnsi="Calibri"/>
+          <w:sz w:val="20"/>
+          <w:szCs w:val="20"/>
+        </w:rPr>
+        <w:t>- Gestion et optimisation du processus d’inspection</w:t>
+      </w:r>
+    </w:p>
+    <w:p>
+      <w:pPr>
+        <w:pStyle w:val="Corpsdetexte"/>
+        <w:rPr>
+          <w:rFonts w:ascii="Calibri" w:hAnsi="Calibri"/>
+          <w:sz w:val="20"/>
+          <w:szCs w:val="20"/>
+        </w:rPr>
+      </w:pPr>
+      <w:r>
+        <w:rPr>
+          <w:rFonts w:ascii="Calibri" w:hAnsi="Calibri"/>
+          <w:sz w:val="20"/>
+          <w:szCs w:val="20"/>
+        </w:rPr>
+        <w:t>- Validation des plans de tests de vérification et de validation (VCV)</w:t>
+      </w:r>
+    </w:p>
+    <w:p>
+      <w:pPr>
+        <w:pStyle w:val="Corpsdetexte"/>
+        <w:rPr>
+          <w:rFonts w:ascii="Calibri" w:hAnsi="Calibri"/>
+          <w:sz w:val="20"/>
+          <w:szCs w:val="20"/>
+        </w:rPr>
+      </w:pPr>
+      <w:r>
+        <w:rPr>
+          <w:rFonts w:ascii="Calibri" w:hAnsi="Calibri"/>
+          <w:sz w:val="20"/>
+          <w:szCs w:val="20"/>
+        </w:rPr>
+        <w:t>- Gestion des dérogations</w:t>
+      </w:r>
+    </w:p>
+    <w:p>
+      <w:pPr>
+        <w:pStyle w:val="Corpsdetexte"/>
+        <w:rPr>
+          <w:rFonts w:ascii="Calibri" w:hAnsi="Calibri"/>
+          <w:sz w:val="20"/>
+          <w:szCs w:val="20"/>
+        </w:rPr>
+      </w:pPr>
+      <w:r>
+        <w:rPr>
+          <w:rFonts w:ascii="Calibri" w:hAnsi="Calibri"/>
+          <w:sz w:val="20"/>
+          <w:szCs w:val="20"/>
+        </w:rPr>
+        <w:t>- Gestion des dossiers qualité et des certificats de conformité</w:t>
+      </w:r>
+    </w:p>
+    <w:p>
+      <w:pPr>
+        <w:pStyle w:val="Corpsdetexte"/>
+        <w:rPr>
+          <w:rFonts w:ascii="Calibri" w:hAnsi="Calibri"/>
+          <w:sz w:val="20"/>
+          <w:szCs w:val="20"/>
+        </w:rPr>
+      </w:pPr>
+      <w:r>
+        <w:rPr>
+          <w:rFonts w:ascii="Calibri" w:hAnsi="Calibri"/>
+          <w:sz w:val="20"/>
+          <w:szCs w:val="20"/>
+        </w:rPr>
+        <w:t>- Utilisation de Power BI pour la création de dashboards d’analyse des réclamations, des RAN et des incidents internes</w:t>
+      </w:r>
+    </w:p>
+    <w:p>
+      <w:pPr>
+        <w:pStyle w:val="Corpsdetexte"/>
+        <w:rPr>
+          <w:rFonts w:ascii="Calibri" w:hAnsi="Calibri"/>
+          <w:sz w:val="20"/>
+          <w:szCs w:val="20"/>
+        </w:rPr>
+      </w:pPr>
+    </w:p>
+    <w:p>
+      <w:pPr>
+        <w:pStyle w:val="Corpsdetexte"/>
+        <w:rPr>
+          <w:rFonts w:ascii="Calibri" w:hAnsi="Calibri"/>
+          <w:sz w:val="20"/>
+          <w:szCs w:val="20"/>
+        </w:rPr>
+      </w:pPr>
+    </w:p>
+    <w:p>
+      <w:pPr>
+        <w:pStyle w:val="Corpsdetexte"/>
+      </w:pPr>
+    </w:p>
+    <w:p>
+      <w:pPr>
+        <w:pStyle w:val="Corpsdetexte"/>
         <w:rPr>
           <w:rFonts w:ascii="Calibri" w:hAnsi="Calibri" w:cs="Calibri"/>
           <w:sz w:val="20"/>
           <w:szCs w:val="20"/>
         </w:rPr>
-        <w:t xml:space="preserve"/>
-      </w:r>
-      <w:r>
-        <w:rPr>
-          <w:rFonts w:ascii="Calibri" w:hAnsi="Calibri"/>
-        </w:rPr>
-        <w:t xml:space="preserve"/>
-      </w:r>
+      </w:pPr>
+      <w:proofErr w:type="gramStart"/>
       <w:r>
         <w:rPr>
           <w:rFonts w:ascii="Calibri" w:hAnsi="Calibri" w:cs="Calibri"/>
-          <w:sz w:val="20"/>
-          <w:szCs w:val="20"/>
-        </w:rPr>
-        <w:t xml:space="preserve">ALSTOM TRANSPORT – Programmes de signalisation 09/2021 – 02/2022 1 an 4 mois</w:t>
+          <w:b/>
+          <w:bCs/>
+          <w:sz w:val="20"/>
+          <w:szCs w:val="20"/>
+        </w:rPr>
+        <w:t>Outils:</w:t>
+      </w:r>
+      <w:proofErr w:type="gramEnd"/>
+      <w:r>
+        <w:rPr>
+          <w:rFonts w:ascii="Calibri" w:hAnsi="Calibri" w:cs="Calibri"/>
+          <w:sz w:val="20"/>
+          <w:szCs w:val="20"/>
+        </w:rPr>
+        <w:t xml:space="preserve"> Power BI</w:t>
+      </w:r>
+      <w:r>
+        <w:rPr>
+          <w:rFonts w:ascii="Calibri" w:hAnsi="Calibri" w:cs="Calibri"/>
+          <w:sz w:val="20"/>
+          <w:szCs w:val="20"/>
+        </w:rPr>
+        <w:t>ALSTOM TRANSPORT</w:t>
+      </w:r>
+    </w:p>
+    <w:p>
+      <w:pPr>
+        <w:pStyle w:val="Corpsdetexte"/>
+        <w:rPr>
+          <w:rFonts w:ascii="Calibri" w:hAnsi="Calibri" w:cs="Calibri"/>
+          <w:sz w:val="20"/>
+          <w:szCs w:val="20"/>
+        </w:rPr>
+      </w:pPr>
+    </w:p>
+    <w:p>
+      <w:pPr>
+        <w:pStyle w:val="Corpsdetexte"/>
+      </w:pPr>
+      <w:r>
+        <w:rPr>
+          <w:rFonts w:ascii="Calibri" w:hAnsi="Calibri" w:cs="Calibri"/>
+          <w:sz w:val="20"/>
+          <w:szCs w:val="20"/>
+        </w:rPr>
+        <w:t xml:space="preserve"> Programmes de signalisation 09/2021 – 02/2022 1 an et 4 mois</w:t>
       </w:r>
     </w:p>
     <w:p>
@@ -1199,7 +1411,7 @@
           <w:noProof/>
         </w:rPr>
         <w:pict>
-          <v:line id="Ligne 1" o:spid="_x0000_s2051" style="position:absolute;z-index:19;visibility:visible;mso-wrap-style:square;mso-wrap-distance-left:.05pt;mso-wrap-distance-top:.05pt;mso-wrap-distance-right:.05pt;mso-wrap-distance-bottom:.05pt;mso-position-horizontal:absolute;mso-position-horizontal-relative:text;mso-position-vertical:absolute;mso-position-vertical-relative:text" from="5.7pt,-1.25pt" to="517.55pt,-.6pt" o:gfxdata="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" strokecolor="#3465a4" strokeweight="0"/>
+          <v:line id="_x0000_s2053" style="position:absolute;z-index:251655168;visibility:visible;mso-wrap-style:square;mso-wrap-distance-left:.05pt;mso-wrap-distance-top:.05pt;mso-wrap-distance-right:.05pt;mso-wrap-distance-bottom:.05pt;mso-position-horizontal:absolute;mso-position-horizontal-relative:text;mso-position-vertical:absolute;mso-position-vertical-relative:text" from="5.7pt,-1.25pt" to="517.55pt,-.6pt" o:gfxdata="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" strokecolor="#3465a4" strokeweight="0"/>
         </w:pict>
       </w:r>
     </w:p>
@@ -1219,48 +1431,191 @@
           <w:sz w:val="20"/>
           <w:szCs w:val="20"/>
         </w:rPr>
-        <w:t xml:space="preserve">Ingénieur qualité projet – Software</w:t>
-      </w:r>
-    </w:p>
-    <w:p>
-      <w:pPr>
-        <w:pStyle w:val="Corpsdetexte"/>
-      </w:pPr>
-      <w:r>
-        <w:rPr>
-          <w:rFonts w:ascii="Calibri" w:hAnsi="Calibri"/>
-          <w:sz w:val="20"/>
-          <w:szCs w:val="20"/>
-        </w:rPr>
-        <w:t xml:space="preserve"/>
-      </w:r>
-    </w:p>
-    <w:p>
-      <w:pPr>
-        <w:pStyle w:val="Corpsdetexte"/>
-        <w:rPr>
-          <w:rFonts w:ascii="Calibri" w:hAnsi="Calibri"/>
-        </w:rPr>
-      </w:pPr>
-      <w:r>
-        <w:rPr>
-          <w:rFonts w:ascii="Calibri" w:hAnsi="Calibri"/>
-        </w:rPr>
-        <w:t xml:space="preserve">- Élaboration et mise en œuvre du plan qualité. - Surveillance de l’application stricte des processus de développement afin d’assurer le respect des normes qualité. - Accompagnement des équipes programmes dans la préparation des jalons. - Contrôle de la conformité des livrables pour autoriser la livraison au client. - Gestion des dérogations et des analyses 8D. - Interface avec la planification de la production. </w:t>
-      </w:r>
-    </w:p>
-    <w:p>
-      <w:pPr>
-        <w:pStyle w:val="Corpsdetexte"/>
-      </w:pPr>
-      <w:r>
-        <w:rPr>
-          <w:rFonts w:ascii="Calibri" w:hAnsi="Calibri"/>
-          <w:sz w:val="20"/>
-          <w:szCs w:val="20"/>
-        </w:rPr>
-        <w:t xml:space="preserve"/>
-      </w:r>
+        <w:t>Ingénieur qualité projet – Software</w:t>
+      </w:r>
+    </w:p>
+    <w:p>
+      <w:pPr>
+        <w:pStyle w:val="Corpsdetexte"/>
+      </w:pPr>
+    </w:p>
+    <w:p>
+      <w:pPr>
+        <w:pStyle w:val="Corpsdetexte"/>
+        <w:rPr>
+          <w:rFonts w:ascii="Calibri" w:hAnsi="Calibri"/>
+          <w:sz w:val="20"/>
+          <w:szCs w:val="20"/>
+        </w:rPr>
+      </w:pPr>
+      <w:r>
+        <w:rPr>
+          <w:rFonts w:ascii="Calibri" w:hAnsi="Calibri"/>
+          <w:sz w:val="20"/>
+          <w:szCs w:val="20"/>
+        </w:rPr>
+        <w:t>- Élaboration et mise en œuvre du plan qualité</w:t>
+      </w:r>
+    </w:p>
+    <w:p>
+      <w:pPr>
+        <w:pStyle w:val="Corpsdetexte"/>
+        <w:rPr>
+          <w:rFonts w:ascii="Calibri" w:hAnsi="Calibri"/>
+          <w:sz w:val="20"/>
+          <w:szCs w:val="20"/>
+        </w:rPr>
+      </w:pPr>
+      <w:r>
+        <w:rPr>
+          <w:rFonts w:ascii="Calibri" w:hAnsi="Calibri"/>
+          <w:sz w:val="20"/>
+          <w:szCs w:val="20"/>
+        </w:rPr>
+        <w:t>- Surveillance de l’application stricte des processus de développement afin d’assurer le respect des normes qualité</w:t>
+      </w:r>
+    </w:p>
+    <w:p>
+      <w:pPr>
+        <w:pStyle w:val="Corpsdetexte"/>
+        <w:rPr>
+          <w:rFonts w:ascii="Calibri" w:hAnsi="Calibri"/>
+          <w:sz w:val="20"/>
+          <w:szCs w:val="20"/>
+        </w:rPr>
+      </w:pPr>
+      <w:r>
+        <w:rPr>
+          <w:rFonts w:ascii="Calibri" w:hAnsi="Calibri"/>
+          <w:sz w:val="20"/>
+          <w:szCs w:val="20"/>
+        </w:rPr>
+        <w:t>- Accompagnement des équipes programmes dans la préparation des jalons</w:t>
+      </w:r>
+    </w:p>
+    <w:p>
+      <w:pPr>
+        <w:pStyle w:val="Corpsdetexte"/>
+        <w:rPr>
+          <w:rFonts w:ascii="Calibri" w:hAnsi="Calibri"/>
+          <w:sz w:val="20"/>
+          <w:szCs w:val="20"/>
+        </w:rPr>
+      </w:pPr>
+      <w:r>
+        <w:rPr>
+          <w:rFonts w:ascii="Calibri" w:hAnsi="Calibri"/>
+          <w:sz w:val="20"/>
+          <w:szCs w:val="20"/>
+        </w:rPr>
+        <w:t>- Contrôle de la conformité des livrables et autorisation de la livraison au client</w:t>
+      </w:r>
+    </w:p>
+    <w:p>
+      <w:pPr>
+        <w:pStyle w:val="Corpsdetexte"/>
+        <w:rPr>
+          <w:rFonts w:ascii="Calibri" w:hAnsi="Calibri"/>
+          <w:sz w:val="20"/>
+          <w:szCs w:val="20"/>
+        </w:rPr>
+      </w:pPr>
+      <w:r>
+        <w:rPr>
+          <w:rFonts w:ascii="Calibri" w:hAnsi="Calibri"/>
+          <w:sz w:val="20"/>
+          <w:szCs w:val="20"/>
+        </w:rPr>
+        <w:t>- Gestion des dérogations et des analyses 8D</w:t>
+      </w:r>
+    </w:p>
+    <w:p>
+      <w:pPr>
+        <w:pStyle w:val="Corpsdetexte"/>
+        <w:rPr>
+          <w:rFonts w:ascii="Calibri" w:hAnsi="Calibri"/>
+          <w:sz w:val="20"/>
+          <w:szCs w:val="20"/>
+        </w:rPr>
+      </w:pPr>
+      <w:r>
+        <w:rPr>
+          <w:rFonts w:ascii="Calibri" w:hAnsi="Calibri"/>
+          <w:sz w:val="20"/>
+          <w:szCs w:val="20"/>
+        </w:rPr>
+        <w:t>- Interface avec la planification de production</w:t>
+      </w:r>
+    </w:p>
+    <w:p>
+      <w:pPr>
+        <w:pStyle w:val="Corpsdetexte"/>
+        <w:rPr>
+          <w:rFonts w:ascii="Calibri" w:hAnsi="Calibri"/>
+          <w:sz w:val="20"/>
+          <w:szCs w:val="20"/>
+        </w:rPr>
+      </w:pPr>
+    </w:p>
+    <w:p>
+      <w:pPr>
+        <w:pStyle w:val="Corpsdetexte"/>
+        <w:rPr>
+          <w:rFonts w:ascii="Calibri" w:hAnsi="Calibri"/>
+          <w:sz w:val="20"/>
+          <w:szCs w:val="20"/>
+        </w:rPr>
+      </w:pPr>
+    </w:p>
+    <w:p>
+      <w:pPr>
+        <w:pStyle w:val="Corpsdetexte"/>
+        <w:rPr>
+          <w:rFonts w:ascii="Calibri" w:hAnsi="Calibri"/>
+          <w:sz w:val="20"/>
+          <w:szCs w:val="20"/>
+        </w:rPr>
+      </w:pPr>
+    </w:p>
+    <w:p>
+      <w:pPr>
+        <w:pStyle w:val="Corpsdetexte"/>
+        <w:rPr>
+          <w:rFonts w:ascii="Calibri" w:hAnsi="Calibri"/>
+          <w:sz w:val="20"/>
+          <w:szCs w:val="20"/>
+        </w:rPr>
+      </w:pPr>
+    </w:p>
+    <w:p>
+      <w:pPr>
+        <w:pStyle w:val="Corpsdetexte"/>
+        <w:rPr>
+          <w:rFonts w:ascii="Calibri" w:hAnsi="Calibri"/>
+          <w:sz w:val="20"/>
+          <w:szCs w:val="20"/>
+        </w:rPr>
+      </w:pPr>
+    </w:p>
+    <w:p>
+      <w:pPr>
+        <w:pStyle w:val="Corpsdetexte"/>
+        <w:rPr>
+          <w:rFonts w:ascii="Calibri" w:hAnsi="Calibri"/>
+          <w:sz w:val="20"/>
+          <w:szCs w:val="20"/>
+        </w:rPr>
+      </w:pPr>
+    </w:p>
+    <w:p>
+      <w:pPr>
+        <w:pStyle w:val="Corpsdetexte"/>
+        <w:rPr>
+          <w:rFonts w:ascii="Calibri" w:hAnsi="Calibri"/>
+          <w:sz w:val="20"/>
+          <w:szCs w:val="20"/>
+        </w:rPr>
+      </w:pPr>
     </w:p>
     <w:p>
       <w:pPr>
@@ -1272,21 +1627,7 @@
           <w:sz w:val="20"/>
           <w:szCs w:val="20"/>
         </w:rPr>
-        <w:t xml:space="preserve"/>
-      </w:r>
-      <w:r>
-        <w:rPr>
-          <w:rFonts w:ascii="Calibri" w:hAnsi="Calibri"/>
-        </w:rPr>
-        <w:t xml:space="preserve"/>
-      </w:r>
-      <w:r>
-        <w:rPr>
-          <w:rFonts w:ascii="Calibri" w:hAnsi="Calibri" w:cs="Calibri"/>
-          <w:sz w:val="20"/>
-          <w:szCs w:val="20"/>
-        </w:rPr>
-        <w:t xml:space="preserve">SECTRONIC – Assemblage des cartes électroniques 09/2018 – 09/2021 3 ans</w:t>
+        <w:t>SECTRONIC – Assemblage des cartes électroniques 09/2018 – 09/2021 3 ans</w:t>
       </w:r>
     </w:p>
     <w:p>
@@ -1303,7 +1644,7 @@
           <w:noProof/>
         </w:rPr>
         <w:pict>
-          <v:line id="Ligne 1" o:spid="_x0000_s2051" style="position:absolute;z-index:19;visibility:visible;mso-wrap-style:square;mso-wrap-distance-left:.05pt;mso-wrap-distance-top:.05pt;mso-wrap-distance-right:.05pt;mso-wrap-distance-bottom:.05pt;mso-position-horizontal:absolute;mso-position-horizontal-relative:text;mso-position-vertical:absolute;mso-position-vertical-relative:text" from="5.7pt,-1.25pt" to="517.55pt,-.6pt" o:gfxdata="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" strokecolor="#3465a4" strokeweight="0"/>
+          <v:line id="_x0000_s2052" style="position:absolute;z-index:251656192;visibility:visible;mso-wrap-style:square;mso-wrap-distance-left:.05pt;mso-wrap-distance-top:.05pt;mso-wrap-distance-right:.05pt;mso-wrap-distance-bottom:.05pt;mso-position-horizontal:absolute;mso-position-horizontal-relative:text;mso-position-vertical:absolute;mso-position-vertical-relative:text" from="5.7pt,-1.25pt" to="517.55pt,-.6pt" o:gfxdata="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" strokecolor="#3465a4" strokeweight="0"/>
         </w:pict>
       </w:r>
     </w:p>
@@ -1323,66 +1664,278 @@
           <w:sz w:val="20"/>
           <w:szCs w:val="20"/>
         </w:rPr>
-        <w:t xml:space="preserve">Ingénieur qualité / amélioration continue – Cartes électroniques</w:t>
-      </w:r>
-    </w:p>
-    <w:p>
-      <w:pPr>
-        <w:pStyle w:val="Corpsdetexte"/>
-      </w:pPr>
-      <w:r>
-        <w:rPr>
-          <w:rFonts w:ascii="Calibri" w:hAnsi="Calibri"/>
-          <w:sz w:val="20"/>
-          <w:szCs w:val="20"/>
-        </w:rPr>
-        <w:t xml:space="preserve"/>
-      </w:r>
-    </w:p>
-    <w:p>
-      <w:pPr>
-        <w:pStyle w:val="Corpsdetexte"/>
-        <w:rPr>
-          <w:rFonts w:ascii="Calibri" w:hAnsi="Calibri"/>
-        </w:rPr>
-      </w:pPr>
-      <w:r>
-        <w:rPr>
-          <w:rFonts w:ascii="Calibri" w:hAnsi="Calibri"/>
-        </w:rPr>
-        <w:t xml:space="preserve">- Préparation, animation et coordination des audits internes. - Mise en œuvre des outils Lean Six Sigma pour l’amélioration continue et l’optimisation des processus. - Validation des processus par études de capabilité, gestion des analyses de risques et élaboration des plans de surveillance. - Élaboration et suivi du plan de surveillance de l’atelier d’assemblage des cartes électroniques. - Résolution de problèmes et analyse des causes racines. - Gestion efficace des réclamations à l’aide d’outils de résolution tels que 8D et QRQC. - Animateur AMDEC et mise en place de la procédure AMDEC. - Gestion des plans d’actions correctives. - Qualification des procédés spéciaux. - Élaboration et validation des dossiers First Article Inspection (FAI). - Conception et déploiement de solutions de gestion de produits périssables (Excel, Access, VBA). - Utilisation de plans d’expériences pour l’optimisation des paramètres statistiques afin de contrôler et réduire les variations du processus. </w:t>
-      </w:r>
-    </w:p>
-    <w:p>
-      <w:pPr>
-        <w:pStyle w:val="Corpsdetexte"/>
-      </w:pPr>
-      <w:r>
-        <w:rPr>
-          <w:rFonts w:ascii="Calibri" w:hAnsi="Calibri"/>
-          <w:sz w:val="20"/>
-          <w:szCs w:val="20"/>
-        </w:rPr>
-        <w:t xml:space="preserve"/>
-      </w:r>
-    </w:p>
-    <w:p>
-      <w:pPr>
-        <w:pStyle w:val="Corpsdetexte"/>
-      </w:pPr>
-      <w:r>
-        <w:rPr>
-          <w:rFonts w:ascii="Calibri" w:hAnsi="Calibri" w:cs="Calibri"/>
-          <w:sz w:val="20"/>
-          <w:szCs w:val="20"/>
-        </w:rPr>
-        <w:t xml:space="preserve"/>
-      </w:r>
-    </w:p>
-    <w:p>
-      <w:pPr>
-        <w:pStyle w:val="Corpsdetexte"/>
-      </w:pPr>
+        <w:t>Ingénieur qualité/amélioration continue – Cartes électroniques</w:t>
+      </w:r>
+    </w:p>
+    <w:p>
+      <w:pPr>
+        <w:pStyle w:val="Corpsdetexte"/>
+      </w:pPr>
+    </w:p>
+    <w:p>
+      <w:pPr>
+        <w:pStyle w:val="Corpsdetexte"/>
+        <w:rPr>
+          <w:rFonts w:ascii="Calibri" w:hAnsi="Calibri"/>
+          <w:sz w:val="20"/>
+          <w:szCs w:val="20"/>
+        </w:rPr>
+      </w:pPr>
+      <w:r>
+        <w:rPr>
+          <w:rFonts w:ascii="Calibri" w:hAnsi="Calibri"/>
+          <w:sz w:val="20"/>
+          <w:szCs w:val="20"/>
+        </w:rPr>
+        <w:t>- Préparation, animation et coordination des audits internes</w:t>
+      </w:r>
+    </w:p>
+    <w:p>
+      <w:pPr>
+        <w:pStyle w:val="Corpsdetexte"/>
+        <w:rPr>
+          <w:rFonts w:ascii="Calibri" w:hAnsi="Calibri"/>
+          <w:sz w:val="20"/>
+          <w:szCs w:val="20"/>
+        </w:rPr>
+      </w:pPr>
+      <w:r>
+        <w:rPr>
+          <w:rFonts w:ascii="Calibri" w:hAnsi="Calibri"/>
+          <w:sz w:val="20"/>
+          <w:szCs w:val="20"/>
+        </w:rPr>
+        <w:t>- Mise en œuvre des outils Lean : utilisation des méthodologies Lean Six Sigma pour l’amélioration continue et l’optimisation des processus</w:t>
+      </w:r>
+    </w:p>
+    <w:p>
+      <w:pPr>
+        <w:pStyle w:val="Corpsdetexte"/>
+        <w:rPr>
+          <w:rFonts w:ascii="Calibri" w:hAnsi="Calibri"/>
+          <w:sz w:val="20"/>
+          <w:szCs w:val="20"/>
+        </w:rPr>
+      </w:pPr>
+      <w:r>
+        <w:rPr>
+          <w:rFonts w:ascii="Calibri" w:hAnsi="Calibri"/>
+          <w:sz w:val="20"/>
+          <w:szCs w:val="20"/>
+        </w:rPr>
+        <w:t>- Validation des procédés par études de capabilité, gestion des analyses de risques et élaboration des plans de surveillance</w:t>
+      </w:r>
+    </w:p>
+    <w:p>
+      <w:pPr>
+        <w:pStyle w:val="Corpsdetexte"/>
+        <w:rPr>
+          <w:rFonts w:ascii="Calibri" w:hAnsi="Calibri"/>
+          <w:sz w:val="20"/>
+          <w:szCs w:val="20"/>
+        </w:rPr>
+      </w:pPr>
+      <w:r>
+        <w:rPr>
+          <w:rFonts w:ascii="Calibri" w:hAnsi="Calibri"/>
+          <w:sz w:val="20"/>
+          <w:szCs w:val="20"/>
+        </w:rPr>
+        <w:t>- Élaboration et suivi du plan de surveillance de l’atelier d’assemblage des cartes électroniques</w:t>
+      </w:r>
+    </w:p>
+    <w:p>
+      <w:pPr>
+        <w:pStyle w:val="Corpsdetexte"/>
+        <w:rPr>
+          <w:rFonts w:ascii="Calibri" w:hAnsi="Calibri"/>
+          <w:sz w:val="20"/>
+          <w:szCs w:val="20"/>
+        </w:rPr>
+      </w:pPr>
+      <w:r>
+        <w:rPr>
+          <w:rFonts w:ascii="Calibri" w:hAnsi="Calibri"/>
+          <w:sz w:val="20"/>
+          <w:szCs w:val="20"/>
+        </w:rPr>
+        <w:t>- Résolution de problèmes et analyse des causes racines</w:t>
+      </w:r>
+    </w:p>
+    <w:p>
+      <w:pPr>
+        <w:pStyle w:val="Corpsdetexte"/>
+        <w:rPr>
+          <w:rFonts w:ascii="Calibri" w:hAnsi="Calibri"/>
+          <w:sz w:val="20"/>
+          <w:szCs w:val="20"/>
+        </w:rPr>
+      </w:pPr>
+      <w:r>
+        <w:rPr>
+          <w:rFonts w:ascii="Calibri" w:hAnsi="Calibri"/>
+          <w:sz w:val="20"/>
+          <w:szCs w:val="20"/>
+        </w:rPr>
+        <w:t>- Gestion efficace des réclamations via des outils de résolution de problèmes tels que 8D et QRQC</w:t>
+      </w:r>
+    </w:p>
+    <w:p>
+      <w:pPr>
+        <w:pStyle w:val="Corpsdetexte"/>
+        <w:rPr>
+          <w:rFonts w:ascii="Calibri" w:hAnsi="Calibri"/>
+          <w:sz w:val="20"/>
+          <w:szCs w:val="20"/>
+        </w:rPr>
+      </w:pPr>
+      <w:r>
+        <w:rPr>
+          <w:rFonts w:ascii="Calibri" w:hAnsi="Calibri"/>
+          <w:sz w:val="20"/>
+          <w:szCs w:val="20"/>
+        </w:rPr>
+        <w:t>- Animateur AMDEC et mise en place de la procédure AMDEC</w:t>
+      </w:r>
+    </w:p>
+    <w:p>
+      <w:pPr>
+        <w:pStyle w:val="Corpsdetexte"/>
+        <w:rPr>
+          <w:rFonts w:ascii="Calibri" w:hAnsi="Calibri"/>
+          <w:sz w:val="20"/>
+          <w:szCs w:val="20"/>
+        </w:rPr>
+      </w:pPr>
+      <w:r>
+        <w:rPr>
+          <w:rFonts w:ascii="Calibri" w:hAnsi="Calibri"/>
+          <w:sz w:val="20"/>
+          <w:szCs w:val="20"/>
+        </w:rPr>
+        <w:t>- Gestion des plans d’actions correctives</w:t>
+      </w:r>
+    </w:p>
+    <w:p>
+      <w:pPr>
+        <w:pStyle w:val="Corpsdetexte"/>
+        <w:rPr>
+          <w:rFonts w:ascii="Calibri" w:hAnsi="Calibri"/>
+          <w:sz w:val="20"/>
+          <w:szCs w:val="20"/>
+        </w:rPr>
+      </w:pPr>
+      <w:r>
+        <w:rPr>
+          <w:rFonts w:ascii="Calibri" w:hAnsi="Calibri"/>
+          <w:sz w:val="20"/>
+          <w:szCs w:val="20"/>
+        </w:rPr>
+        <w:t>- Qualification des procédés spéciaux</w:t>
+      </w:r>
+    </w:p>
+    <w:p>
+      <w:pPr>
+        <w:pStyle w:val="Corpsdetexte"/>
+        <w:rPr>
+          <w:rFonts w:ascii="Calibri" w:hAnsi="Calibri"/>
+          <w:sz w:val="20"/>
+          <w:szCs w:val="20"/>
+        </w:rPr>
+      </w:pPr>
+      <w:r>
+        <w:rPr>
+          <w:rFonts w:ascii="Calibri" w:hAnsi="Calibri"/>
+          <w:sz w:val="20"/>
+          <w:szCs w:val="20"/>
+        </w:rPr>
+        <w:t>- Élaboration et validation des dossiers FAI</w:t>
+      </w:r>
+    </w:p>
+    <w:p>
+      <w:pPr>
+        <w:pStyle w:val="Corpsdetexte"/>
+        <w:rPr>
+          <w:rFonts w:ascii="Calibri" w:hAnsi="Calibri"/>
+          <w:sz w:val="20"/>
+          <w:szCs w:val="20"/>
+        </w:rPr>
+      </w:pPr>
+      <w:r>
+        <w:rPr>
+          <w:rFonts w:ascii="Calibri" w:hAnsi="Calibri"/>
+          <w:sz w:val="20"/>
+          <w:szCs w:val="20"/>
+        </w:rPr>
+        <w:t>- Conception et déploiement de solutions de gestion de produits périssables (Excel, Access, VBA)</w:t>
+      </w:r>
+    </w:p>
+    <w:p>
+      <w:pPr>
+        <w:pStyle w:val="Corpsdetexte"/>
+        <w:rPr>
+          <w:rFonts w:ascii="Calibri" w:hAnsi="Calibri"/>
+          <w:sz w:val="20"/>
+          <w:szCs w:val="20"/>
+        </w:rPr>
+      </w:pPr>
+      <w:r>
+        <w:rPr>
+          <w:rFonts w:ascii="Calibri" w:hAnsi="Calibri"/>
+          <w:sz w:val="20"/>
+          <w:szCs w:val="20"/>
+        </w:rPr>
+        <w:t>- Utilisation des plans d’expériences pour l’optimisation des paramètres</w:t>
+      </w:r>
+    </w:p>
+    <w:p>
+      <w:pPr>
+        <w:pStyle w:val="Corpsdetexte"/>
+        <w:rPr>
+          <w:rFonts w:ascii="Calibri" w:hAnsi="Calibri"/>
+          <w:sz w:val="20"/>
+          <w:szCs w:val="20"/>
+        </w:rPr>
+      </w:pPr>
+      <w:r>
+        <w:rPr>
+          <w:rFonts w:ascii="Calibri" w:hAnsi="Calibri"/>
+          <w:sz w:val="20"/>
+          <w:szCs w:val="20"/>
+        </w:rPr>
+        <w:t>- Analyse statistique pour contrôler et réduire les variations du processus</w:t>
+      </w:r>
+    </w:p>
+    <w:p>
+      <w:pPr>
+        <w:pStyle w:val="Corpsdetexte"/>
+        <w:rPr>
+          <w:rFonts w:ascii="Calibri" w:hAnsi="Calibri"/>
+          <w:sz w:val="20"/>
+          <w:szCs w:val="20"/>
+        </w:rPr>
+      </w:pPr>
+    </w:p>
+    <w:p>
+      <w:pPr>
+        <w:pStyle w:val="Corpsdetexte"/>
+        <w:rPr>
+          <w:rFonts w:ascii="Calibri" w:hAnsi="Calibri"/>
+          <w:sz w:val="20"/>
+          <w:szCs w:val="20"/>
+        </w:rPr>
+      </w:pPr>
+    </w:p>
+    <w:p>
+      <w:pPr>
+        <w:pStyle w:val="Corpsdetexte"/>
+      </w:pPr>
+    </w:p>
+    <w:p>
+      <w:pPr>
+        <w:pStyle w:val="Corpsdetexte"/>
+      </w:pPr>
+      <w:proofErr w:type="gramStart"/>
       <w:r>
         <w:rPr>
           <w:rFonts w:ascii="Calibri" w:hAnsi="Calibri" w:cs="Calibri"/>
@@ -1391,21 +1944,16 @@
           <w:sz w:val="20"/>
           <w:szCs w:val="20"/>
         </w:rPr>
-        <w:t xml:space="preserve">Outils:</w:t>
-      </w:r>
+        <w:t>Outils:</w:t>
+      </w:r>
+      <w:proofErr w:type="gramEnd"/>
       <w:r>
         <w:rPr>
           <w:rFonts w:ascii="Calibri" w:hAnsi="Calibri" w:cs="Calibri"/>
           <w:sz w:val="20"/>
           <w:szCs w:val="20"/>
         </w:rPr>
-        <w:t xml:space="preserve"> Lean Six Sigma, 8D, QRQC, AMDEC, Excel, Access, VBA</w:t>
-      </w:r>
-      <w:r>
-        <w:rPr>
-          <w:rFonts w:ascii="Calibri" w:hAnsi="Calibri"/>
-        </w:rPr>
-        <w:t xml:space="preserve"/>
+        <w:t xml:space="preserve"> Excel, Access, VBA</w:t>
       </w:r>
     </w:p>
     <w:sectPr>
@@ -1426,7 +1974,7 @@
 </file>
 
 <file path=word/endnotes.xml><?xml version="1.0" encoding="utf-8"?>
-<w:endnotes xmlns:wpc="http://schemas.microsoft.com/office/word/2010/wordprocessingCanvas" xmlns:cx="http://schemas.microsoft.com/office/drawing/2014/chartex" xmlns:cx1="http://schemas.microsoft.com/office/drawing/2015/9/8/chartex" xmlns:cx2="http://schemas.microsoft.com/office/drawing/2015/10/21/chartex" xmlns:cx3="http://schemas.microsoft.com/office/drawing/2016/5/9/chartex" xmlns:cx4="http://schemas.microsoft.com/office/drawing/2016/5/10/chartex" xmlns:cx5="http://schemas.microsoft.com/office/drawing/2016/5/11/chartex" xmlns:cx6="http://schemas.microsoft.com/office/drawing/2016/5/12/chartex" xmlns:cx7="http://schemas.microsoft.com/office/drawing/2016/5/13/chartex" xmlns:cx8="http://schemas.microsoft.com/office/drawing/2016/5/14/chartex" xmlns:mc="http://schemas.openxmlformats.org/markup-compatibility/2006" xmlns:aink="http://schemas.microsoft.com/office/drawing/2016/ink" xmlns:am3d="http://schemas.microsoft.com/office/drawing/2017/model3d" xmlns:o="urn:schemas-microsoft-com:office:office" xmlns:oel="http://schemas.microsoft.com/office/2019/extlst" xmlns:r="http://schemas.openxmlformats.org/officeDocument/2006/relationships" xmlns:m="http://schemas.openxmlformats.org/officeDocument/2006/math" xmlns:v="urn:schemas-microsoft-com:vml" xmlns:wp14="http://schemas.microsoft.com/office/word/2010/wordprocessingDrawing" xmlns:wp="http://schemas.openxmlformats.org/drawingml/2006/wordprocessingDrawing" xmlns:w10="urn:schemas-microsoft-com:office:word" xmlns:w="http://schemas.openxmlformats.org/wordprocessingml/2006/main" xmlns:w14="http://schemas.microsoft.com/office/word/2010/wordml" xmlns:w15="http://schemas.microsoft.com/office/word/2012/wordml" xmlns:w16cex="http://schemas.microsoft.com/office/word/2018/wordml/cex" xmlns:w16cid="http://schemas.microsoft.com/office/word/2016/wordml/cid" xmlns:w16="http://schemas.microsoft.com/office/word/2018/wordml" xmlns:w16sdtdh="http://schemas.microsoft.com/office/word/2020/wordml/sdtdatahash" xmlns:w16se="http://schemas.microsoft.com/office/word/2015/wordml/symex" xmlns:wpg="http://schemas.microsoft.com/office/word/2010/wordprocessingGroup" xmlns:wpi="http://schemas.microsoft.com/office/word/2010/wordprocessingInk" xmlns:wne="http://schemas.microsoft.com/office/word/2006/wordml" xmlns:wps="http://schemas.microsoft.com/office/word/2010/wordprocessingShape" mc:Ignorable="w14 w15 w16se w16cid w16 w16cex w16sdtdh wp14">
+<w:endnotes xmlns:wpc="http://schemas.microsoft.com/office/word/2010/wordprocessingCanvas" xmlns:cx="http://schemas.microsoft.com/office/drawing/2014/chartex" xmlns:cx1="http://schemas.microsoft.com/office/drawing/2015/9/8/chartex" xmlns:cx2="http://schemas.microsoft.com/office/drawing/2015/10/21/chartex" xmlns:cx3="http://schemas.microsoft.com/office/drawing/2016/5/9/chartex" xmlns:cx4="http://schemas.microsoft.com/office/drawing/2016/5/10/chartex" xmlns:cx5="http://schemas.microsoft.com/office/drawing/2016/5/11/chartex" xmlns:cx6="http://schemas.microsoft.com/office/drawing/2016/5/12/chartex" xmlns:cx7="http://schemas.microsoft.com/office/drawing/2016/5/13/chartex" xmlns:cx8="http://schemas.microsoft.com/office/drawing/2016/5/14/chartex" xmlns:mc="http://schemas.openxmlformats.org/markup-compatibility/2006" xmlns:aink="http://schemas.microsoft.com/office/drawing/2016/ink" xmlns:am3d="http://schemas.microsoft.com/office/drawing/2017/model3d" xmlns:o="urn:schemas-microsoft-com:office:office" xmlns:oel="http://schemas.microsoft.com/office/2019/extlst" xmlns:r="http://schemas.openxmlformats.org/officeDocument/2006/relationships" xmlns:m="http://schemas.openxmlformats.org/officeDocument/2006/math" xmlns:v="urn:schemas-microsoft-com:vml" xmlns:wp14="http://schemas.microsoft.com/office/word/2010/wordprocessingDrawing" xmlns:wp="http://schemas.openxmlformats.org/drawingml/2006/wordprocessingDrawing" xmlns:w10="urn:schemas-microsoft-com:office:word" xmlns:w="http://schemas.openxmlformats.org/wordprocessingml/2006/main" xmlns:w14="http://schemas.microsoft.com/office/word/2010/wordml" xmlns:w15="http://schemas.microsoft.com/office/word/2012/wordml" xmlns:w16cex="http://schemas.microsoft.com/office/word/2018/wordml/cex" xmlns:w16cid="http://schemas.microsoft.com/office/word/2016/wordml/cid" xmlns:w16="http://schemas.microsoft.com/office/word/2018/wordml" xmlns:w16du="http://schemas.microsoft.com/office/word/2023/wordml/word16du" xmlns:w16sdtdh="http://schemas.microsoft.com/office/word/2020/wordml/sdtdatahash" xmlns:w16se="http://schemas.microsoft.com/office/word/2015/wordml/symex" xmlns:wpg="http://schemas.microsoft.com/office/word/2010/wordprocessingGroup" xmlns:wpi="http://schemas.microsoft.com/office/word/2010/wordprocessingInk" xmlns:wne="http://schemas.microsoft.com/office/word/2006/wordml" xmlns:wps="http://schemas.microsoft.com/office/word/2010/wordprocessingShape" mc:Ignorable="w14 w15 w16se w16cid w16 w16cex w16sdtdh w16du wp14">
   <w:endnote w:type="separator" w:id="-1">
     <w:p>
       <w:r>
@@ -1445,7 +1993,7 @@
 </file>
 
 <file path=word/footer1.xml><?xml version="1.0" encoding="utf-8"?>
-<w:ftr xmlns:wpc="http://schemas.microsoft.com/office/word/2010/wordprocessingCanvas" xmlns:cx="http://schemas.microsoft.com/office/drawing/2014/chartex" xmlns:cx1="http://schemas.microsoft.com/office/drawing/2015/9/8/chartex" xmlns:cx2="http://schemas.microsoft.com/office/drawing/2015/10/21/chartex" xmlns:cx3="http://schemas.microsoft.com/office/drawing/2016/5/9/chartex" xmlns:cx4="http://schemas.microsoft.com/office/drawing/2016/5/10/chartex" xmlns:cx5="http://schemas.microsoft.com/office/drawing/2016/5/11/chartex" xmlns:cx6="http://schemas.microsoft.com/office/drawing/2016/5/12/chartex" xmlns:cx7="http://schemas.microsoft.com/office/drawing/2016/5/13/chartex" xmlns:cx8="http://schemas.microsoft.com/office/drawing/2016/5/14/chartex" xmlns:mc="http://schemas.openxmlformats.org/markup-compatibility/2006" xmlns:aink="http://schemas.microsoft.com/office/drawing/2016/ink" xmlns:am3d="http://schemas.microsoft.com/office/drawing/2017/model3d" xmlns:o="urn:schemas-microsoft-com:office:office" xmlns:oel="http://schemas.microsoft.com/office/2019/extlst" xmlns:r="http://schemas.openxmlformats.org/officeDocument/2006/relationships" xmlns:m="http://schemas.openxmlformats.org/officeDocument/2006/math" xmlns:v="urn:schemas-microsoft-com:vml" xmlns:wp14="http://schemas.microsoft.com/office/word/2010/wordprocessingDrawing" xmlns:wp="http://schemas.openxmlformats.org/drawingml/2006/wordprocessingDrawing" xmlns:w10="urn:schemas-microsoft-com:office:word" xmlns:w="http://schemas.openxmlformats.org/wordprocessingml/2006/main" xmlns:w14="http://schemas.microsoft.com/office/word/2010/wordml" xmlns:w15="http://schemas.microsoft.com/office/word/2012/wordml" xmlns:w16cex="http://schemas.microsoft.com/office/word/2018/wordml/cex" xmlns:w16cid="http://schemas.microsoft.com/office/word/2016/wordml/cid" xmlns:w16="http://schemas.microsoft.com/office/word/2018/wordml" xmlns:w16sdtdh="http://schemas.microsoft.com/office/word/2020/wordml/sdtdatahash" xmlns:w16se="http://schemas.microsoft.com/office/word/2015/wordml/symex" xmlns:wpg="http://schemas.microsoft.com/office/word/2010/wordprocessingGroup" xmlns:wpi="http://schemas.microsoft.com/office/word/2010/wordprocessingInk" xmlns:wne="http://schemas.microsoft.com/office/word/2006/wordml" xmlns:wps="http://schemas.microsoft.com/office/word/2010/wordprocessingShape" mc:Ignorable="w14 w15 w16se w16cid w16 w16cex w16sdtdh wp14">
+<w:ftr xmlns:wpc="http://schemas.microsoft.com/office/word/2010/wordprocessingCanvas" xmlns:cx="http://schemas.microsoft.com/office/drawing/2014/chartex" xmlns:cx1="http://schemas.microsoft.com/office/drawing/2015/9/8/chartex" xmlns:cx2="http://schemas.microsoft.com/office/drawing/2015/10/21/chartex" xmlns:cx3="http://schemas.microsoft.com/office/drawing/2016/5/9/chartex" xmlns:cx4="http://schemas.microsoft.com/office/drawing/2016/5/10/chartex" xmlns:cx5="http://schemas.microsoft.com/office/drawing/2016/5/11/chartex" xmlns:cx6="http://schemas.microsoft.com/office/drawing/2016/5/12/chartex" xmlns:cx7="http://schemas.microsoft.com/office/drawing/2016/5/13/chartex" xmlns:cx8="http://schemas.microsoft.com/office/drawing/2016/5/14/chartex" xmlns:mc="http://schemas.openxmlformats.org/markup-compatibility/2006" xmlns:aink="http://schemas.microsoft.com/office/drawing/2016/ink" xmlns:am3d="http://schemas.microsoft.com/office/drawing/2017/model3d" xmlns:o="urn:schemas-microsoft-com:office:office" xmlns:oel="http://schemas.microsoft.com/office/2019/extlst" xmlns:r="http://schemas.openxmlformats.org/officeDocument/2006/relationships" xmlns:m="http://schemas.openxmlformats.org/officeDocument/2006/math" xmlns:v="urn:schemas-microsoft-com:vml" xmlns:wp14="http://schemas.microsoft.com/office/word/2010/wordprocessingDrawing" xmlns:wp="http://schemas.openxmlformats.org/drawingml/2006/wordprocessingDrawing" xmlns:w10="urn:schemas-microsoft-com:office:word" xmlns:w="http://schemas.openxmlformats.org/wordprocessingml/2006/main" xmlns:w14="http://schemas.microsoft.com/office/word/2010/wordml" xmlns:w15="http://schemas.microsoft.com/office/word/2012/wordml" xmlns:w16cex="http://schemas.microsoft.com/office/word/2018/wordml/cex" xmlns:w16cid="http://schemas.microsoft.com/office/word/2016/wordml/cid" xmlns:w16="http://schemas.microsoft.com/office/word/2018/wordml" xmlns:w16du="http://schemas.microsoft.com/office/word/2023/wordml/word16du" xmlns:w16sdtdh="http://schemas.microsoft.com/office/word/2020/wordml/sdtdatahash" xmlns:w16se="http://schemas.microsoft.com/office/word/2015/wordml/symex" xmlns:wpg="http://schemas.microsoft.com/office/word/2010/wordprocessingGroup" xmlns:wpi="http://schemas.microsoft.com/office/word/2010/wordprocessingInk" xmlns:wne="http://schemas.microsoft.com/office/word/2006/wordml" xmlns:wps="http://schemas.microsoft.com/office/word/2010/wordprocessingShape" mc:Ignorable="w14 w15 w16se w16cid w16 w16cex w16sdtdh w16du wp14">
   <w:p>
     <w:pPr>
       <w:pStyle w:val="Pieddepage"/>
@@ -1455,7 +2003,7 @@
 </file>
 
 <file path=word/footer2.xml><?xml version="1.0" encoding="utf-8"?>
-<w:ftr xmlns:wpc="http://schemas.microsoft.com/office/word/2010/wordprocessingCanvas" xmlns:cx="http://schemas.microsoft.com/office/drawing/2014/chartex" xmlns:cx1="http://schemas.microsoft.com/office/drawing/2015/9/8/chartex" xmlns:cx2="http://schemas.microsoft.com/office/drawing/2015/10/21/chartex" xmlns:cx3="http://schemas.microsoft.com/office/drawing/2016/5/9/chartex" xmlns:cx4="http://schemas.microsoft.com/office/drawing/2016/5/10/chartex" xmlns:cx5="http://schemas.microsoft.com/office/drawing/2016/5/11/chartex" xmlns:cx6="http://schemas.microsoft.com/office/drawing/2016/5/12/chartex" xmlns:cx7="http://schemas.microsoft.com/office/drawing/2016/5/13/chartex" xmlns:cx8="http://schemas.microsoft.com/office/drawing/2016/5/14/chartex" xmlns:mc="http://schemas.openxmlformats.org/markup-compatibility/2006" xmlns:aink="http://schemas.microsoft.com/office/drawing/2016/ink" xmlns:am3d="http://schemas.microsoft.com/office/drawing/2017/model3d" xmlns:o="urn:schemas-microsoft-com:office:office" xmlns:oel="http://schemas.microsoft.com/office/2019/extlst" xmlns:r="http://schemas.openxmlformats.org/officeDocument/2006/relationships" xmlns:m="http://schemas.openxmlformats.org/officeDocument/2006/math" xmlns:v="urn:schemas-microsoft-com:vml" xmlns:wp14="http://schemas.microsoft.com/office/word/2010/wordprocessingDrawing" xmlns:wp="http://schemas.openxmlformats.org/drawingml/2006/wordprocessingDrawing" xmlns:w10="urn:schemas-microsoft-com:office:word" xmlns:w="http://schemas.openxmlformats.org/wordprocessingml/2006/main" xmlns:w14="http://schemas.microsoft.com/office/word/2010/wordml" xmlns:w15="http://schemas.microsoft.com/office/word/2012/wordml" xmlns:w16cex="http://schemas.microsoft.com/office/word/2018/wordml/cex" xmlns:w16cid="http://schemas.microsoft.com/office/word/2016/wordml/cid" xmlns:w16="http://schemas.microsoft.com/office/word/2018/wordml" xmlns:w16sdtdh="http://schemas.microsoft.com/office/word/2020/wordml/sdtdatahash" xmlns:w16se="http://schemas.microsoft.com/office/word/2015/wordml/symex" xmlns:wpg="http://schemas.microsoft.com/office/word/2010/wordprocessingGroup" xmlns:wpi="http://schemas.microsoft.com/office/word/2010/wordprocessingInk" xmlns:wne="http://schemas.microsoft.com/office/word/2006/wordml" xmlns:wps="http://schemas.microsoft.com/office/word/2010/wordprocessingShape" mc:Ignorable="w14 w15 w16se w16cid w16 w16cex w16sdtdh wp14">
+<w:ftr xmlns:wpc="http://schemas.microsoft.com/office/word/2010/wordprocessingCanvas" xmlns:cx="http://schemas.microsoft.com/office/drawing/2014/chartex" xmlns:cx1="http://schemas.microsoft.com/office/drawing/2015/9/8/chartex" xmlns:cx2="http://schemas.microsoft.com/office/drawing/2015/10/21/chartex" xmlns:cx3="http://schemas.microsoft.com/office/drawing/2016/5/9/chartex" xmlns:cx4="http://schemas.microsoft.com/office/drawing/2016/5/10/chartex" xmlns:cx5="http://schemas.microsoft.com/office/drawing/2016/5/11/chartex" xmlns:cx6="http://schemas.microsoft.com/office/drawing/2016/5/12/chartex" xmlns:cx7="http://schemas.microsoft.com/office/drawing/2016/5/13/chartex" xmlns:cx8="http://schemas.microsoft.com/office/drawing/2016/5/14/chartex" xmlns:mc="http://schemas.openxmlformats.org/markup-compatibility/2006" xmlns:aink="http://schemas.microsoft.com/office/drawing/2016/ink" xmlns:am3d="http://schemas.microsoft.com/office/drawing/2017/model3d" xmlns:o="urn:schemas-microsoft-com:office:office" xmlns:oel="http://schemas.microsoft.com/office/2019/extlst" xmlns:r="http://schemas.openxmlformats.org/officeDocument/2006/relationships" xmlns:m="http://schemas.openxmlformats.org/officeDocument/2006/math" xmlns:v="urn:schemas-microsoft-com:vml" xmlns:wp14="http://schemas.microsoft.com/office/word/2010/wordprocessingDrawing" xmlns:wp="http://schemas.openxmlformats.org/drawingml/2006/wordprocessingDrawing" xmlns:w10="urn:schemas-microsoft-com:office:word" xmlns:w="http://schemas.openxmlformats.org/wordprocessingml/2006/main" xmlns:w14="http://schemas.microsoft.com/office/word/2010/wordml" xmlns:w15="http://schemas.microsoft.com/office/word/2012/wordml" xmlns:w16cex="http://schemas.microsoft.com/office/word/2018/wordml/cex" xmlns:w16cid="http://schemas.microsoft.com/office/word/2016/wordml/cid" xmlns:w16="http://schemas.microsoft.com/office/word/2018/wordml" xmlns:w16du="http://schemas.microsoft.com/office/word/2023/wordml/word16du" xmlns:w16sdtdh="http://schemas.microsoft.com/office/word/2020/wordml/sdtdatahash" xmlns:w16se="http://schemas.microsoft.com/office/word/2015/wordml/symex" xmlns:wpg="http://schemas.microsoft.com/office/word/2010/wordprocessingGroup" xmlns:wpi="http://schemas.microsoft.com/office/word/2010/wordprocessingInk" xmlns:wne="http://schemas.microsoft.com/office/word/2006/wordml" xmlns:wps="http://schemas.microsoft.com/office/word/2010/wordprocessingShape" mc:Ignorable="w14 w15 w16se w16cid w16 w16cex w16sdtdh w16du wp14">
   <w:p>
     <w:pPr>
       <w:pStyle w:val="Pieddepage"/>
@@ -1614,7 +2162,7 @@
 </file>
 
 <file path=word/footer3.xml><?xml version="1.0" encoding="utf-8"?>
-<w:ftr xmlns:wpc="http://schemas.microsoft.com/office/word/2010/wordprocessingCanvas" xmlns:cx="http://schemas.microsoft.com/office/drawing/2014/chartex" xmlns:cx1="http://schemas.microsoft.com/office/drawing/2015/9/8/chartex" xmlns:cx2="http://schemas.microsoft.com/office/drawing/2015/10/21/chartex" xmlns:cx3="http://schemas.microsoft.com/office/drawing/2016/5/9/chartex" xmlns:cx4="http://schemas.microsoft.com/office/drawing/2016/5/10/chartex" xmlns:cx5="http://schemas.microsoft.com/office/drawing/2016/5/11/chartex" xmlns:cx6="http://schemas.microsoft.com/office/drawing/2016/5/12/chartex" xmlns:cx7="http://schemas.microsoft.com/office/drawing/2016/5/13/chartex" xmlns:cx8="http://schemas.microsoft.com/office/drawing/2016/5/14/chartex" xmlns:mc="http://schemas.openxmlformats.org/markup-compatibility/2006" xmlns:aink="http://schemas.microsoft.com/office/drawing/2016/ink" xmlns:am3d="http://schemas.microsoft.com/office/drawing/2017/model3d" xmlns:o="urn:schemas-microsoft-com:office:office" xmlns:oel="http://schemas.microsoft.com/office/2019/extlst" xmlns:r="http://schemas.openxmlformats.org/officeDocument/2006/relationships" xmlns:m="http://schemas.openxmlformats.org/officeDocument/2006/math" xmlns:v="urn:schemas-microsoft-com:vml" xmlns:wp14="http://schemas.microsoft.com/office/word/2010/wordprocessingDrawing" xmlns:wp="http://schemas.openxmlformats.org/drawingml/2006/wordprocessingDrawing" xmlns:w10="urn:schemas-microsoft-com:office:word" xmlns:w="http://schemas.openxmlformats.org/wordprocessingml/2006/main" xmlns:w14="http://schemas.microsoft.com/office/word/2010/wordml" xmlns:w15="http://schemas.microsoft.com/office/word/2012/wordml" xmlns:w16cex="http://schemas.microsoft.com/office/word/2018/wordml/cex" xmlns:w16cid="http://schemas.microsoft.com/office/word/2016/wordml/cid" xmlns:w16="http://schemas.microsoft.com/office/word/2018/wordml" xmlns:w16sdtdh="http://schemas.microsoft.com/office/word/2020/wordml/sdtdatahash" xmlns:w16se="http://schemas.microsoft.com/office/word/2015/wordml/symex" xmlns:wpg="http://schemas.microsoft.com/office/word/2010/wordprocessingGroup" xmlns:wpi="http://schemas.microsoft.com/office/word/2010/wordprocessingInk" xmlns:wne="http://schemas.microsoft.com/office/word/2006/wordml" xmlns:wps="http://schemas.microsoft.com/office/word/2010/wordprocessingShape" mc:Ignorable="w14 w15 w16se w16cid w16 w16cex w16sdtdh wp14">
+<w:ftr xmlns:wpc="http://schemas.microsoft.com/office/word/2010/wordprocessingCanvas" xmlns:cx="http://schemas.microsoft.com/office/drawing/2014/chartex" xmlns:cx1="http://schemas.microsoft.com/office/drawing/2015/9/8/chartex" xmlns:cx2="http://schemas.microsoft.com/office/drawing/2015/10/21/chartex" xmlns:cx3="http://schemas.microsoft.com/office/drawing/2016/5/9/chartex" xmlns:cx4="http://schemas.microsoft.com/office/drawing/2016/5/10/chartex" xmlns:cx5="http://schemas.microsoft.com/office/drawing/2016/5/11/chartex" xmlns:cx6="http://schemas.microsoft.com/office/drawing/2016/5/12/chartex" xmlns:cx7="http://schemas.microsoft.com/office/drawing/2016/5/13/chartex" xmlns:cx8="http://schemas.microsoft.com/office/drawing/2016/5/14/chartex" xmlns:mc="http://schemas.openxmlformats.org/markup-compatibility/2006" xmlns:aink="http://schemas.microsoft.com/office/drawing/2016/ink" xmlns:am3d="http://schemas.microsoft.com/office/drawing/2017/model3d" xmlns:o="urn:schemas-microsoft-com:office:office" xmlns:oel="http://schemas.microsoft.com/office/2019/extlst" xmlns:r="http://schemas.openxmlformats.org/officeDocument/2006/relationships" xmlns:m="http://schemas.openxmlformats.org/officeDocument/2006/math" xmlns:v="urn:schemas-microsoft-com:vml" xmlns:wp14="http://schemas.microsoft.com/office/word/2010/wordprocessingDrawing" xmlns:wp="http://schemas.openxmlformats.org/drawingml/2006/wordprocessingDrawing" xmlns:w10="urn:schemas-microsoft-com:office:word" xmlns:w="http://schemas.openxmlformats.org/wordprocessingml/2006/main" xmlns:w14="http://schemas.microsoft.com/office/word/2010/wordml" xmlns:w15="http://schemas.microsoft.com/office/word/2012/wordml" xmlns:w16cex="http://schemas.microsoft.com/office/word/2018/wordml/cex" xmlns:w16cid="http://schemas.microsoft.com/office/word/2016/wordml/cid" xmlns:w16="http://schemas.microsoft.com/office/word/2018/wordml" xmlns:w16du="http://schemas.microsoft.com/office/word/2023/wordml/word16du" xmlns:w16sdtdh="http://schemas.microsoft.com/office/word/2020/wordml/sdtdatahash" xmlns:w16se="http://schemas.microsoft.com/office/word/2015/wordml/symex" xmlns:wpg="http://schemas.microsoft.com/office/word/2010/wordprocessingGroup" xmlns:wpi="http://schemas.microsoft.com/office/word/2010/wordprocessingInk" xmlns:wne="http://schemas.microsoft.com/office/word/2006/wordml" xmlns:wps="http://schemas.microsoft.com/office/word/2010/wordprocessingShape" mc:Ignorable="w14 w15 w16se w16cid w16 w16cex w16sdtdh w16du wp14">
   <w:p>
     <w:pPr>
       <w:pStyle w:val="Pieddepage"/>
@@ -1772,7 +2320,7 @@
 </file>
 
 <file path=word/footnotes.xml><?xml version="1.0" encoding="utf-8"?>
-<w:footnotes xmlns:wpc="http://schemas.microsoft.com/office/word/2010/wordprocessingCanvas" xmlns:cx="http://schemas.microsoft.com/office/drawing/2014/chartex" xmlns:cx1="http://schemas.microsoft.com/office/drawing/2015/9/8/chartex" xmlns:cx2="http://schemas.microsoft.com/office/drawing/2015/10/21/chartex" xmlns:cx3="http://schemas.microsoft.com/office/drawing/2016/5/9/chartex" xmlns:cx4="http://schemas.microsoft.com/office/drawing/2016/5/10/chartex" xmlns:cx5="http://schemas.microsoft.com/office/drawing/2016/5/11/chartex" xmlns:cx6="http://schemas.microsoft.com/office/drawing/2016/5/12/chartex" xmlns:cx7="http://schemas.microsoft.com/office/drawing/2016/5/13/chartex" xmlns:cx8="http://schemas.microsoft.com/office/drawing/2016/5/14/chartex" xmlns:mc="http://schemas.openxmlformats.org/markup-compatibility/2006" xmlns:aink="http://schemas.microsoft.com/office/drawing/2016/ink" xmlns:am3d="http://schemas.microsoft.com/office/drawing/2017/model3d" xmlns:o="urn:schemas-microsoft-com:office:office" xmlns:oel="http://schemas.microsoft.com/office/2019/extlst" xmlns:r="http://schemas.openxmlformats.org/officeDocument/2006/relationships" xmlns:m="http://schemas.openxmlformats.org/officeDocument/2006/math" xmlns:v="urn:schemas-microsoft-com:vml" xmlns:wp14="http://schemas.microsoft.com/office/word/2010/wordprocessingDrawing" xmlns:wp="http://schemas.openxmlformats.org/drawingml/2006/wordprocessingDrawing" xmlns:w10="urn:schemas-microsoft-com:office:word" xmlns:w="http://schemas.openxmlformats.org/wordprocessingml/2006/main" xmlns:w14="http://schemas.microsoft.com/office/word/2010/wordml" xmlns:w15="http://schemas.microsoft.com/office/word/2012/wordml" xmlns:w16cex="http://schemas.microsoft.com/office/word/2018/wordml/cex" xmlns:w16cid="http://schemas.microsoft.com/office/word/2016/wordml/cid" xmlns:w16="http://schemas.microsoft.com/office/word/2018/wordml" xmlns:w16sdtdh="http://schemas.microsoft.com/office/word/2020/wordml/sdtdatahash" xmlns:w16se="http://schemas.microsoft.com/office/word/2015/wordml/symex" xmlns:wpg="http://schemas.microsoft.com/office/word/2010/wordprocessingGroup" xmlns:wpi="http://schemas.microsoft.com/office/word/2010/wordprocessingInk" xmlns:wne="http://schemas.microsoft.com/office/word/2006/wordml" xmlns:wps="http://schemas.microsoft.com/office/word/2010/wordprocessingShape" mc:Ignorable="w14 w15 w16se w16cid w16 w16cex w16sdtdh wp14">
+<w:footnotes xmlns:wpc="http://schemas.microsoft.com/office/word/2010/wordprocessingCanvas" xmlns:cx="http://schemas.microsoft.com/office/drawing/2014/chartex" xmlns:cx1="http://schemas.microsoft.com/office/drawing/2015/9/8/chartex" xmlns:cx2="http://schemas.microsoft.com/office/drawing/2015/10/21/chartex" xmlns:cx3="http://schemas.microsoft.com/office/drawing/2016/5/9/chartex" xmlns:cx4="http://schemas.microsoft.com/office/drawing/2016/5/10/chartex" xmlns:cx5="http://schemas.microsoft.com/office/drawing/2016/5/11/chartex" xmlns:cx6="http://schemas.microsoft.com/office/drawing/2016/5/12/chartex" xmlns:cx7="http://schemas.microsoft.com/office/drawing/2016/5/13/chartex" xmlns:cx8="http://schemas.microsoft.com/office/drawing/2016/5/14/chartex" xmlns:mc="http://schemas.openxmlformats.org/markup-compatibility/2006" xmlns:aink="http://schemas.microsoft.com/office/drawing/2016/ink" xmlns:am3d="http://schemas.microsoft.com/office/drawing/2017/model3d" xmlns:o="urn:schemas-microsoft-com:office:office" xmlns:oel="http://schemas.microsoft.com/office/2019/extlst" xmlns:r="http://schemas.openxmlformats.org/officeDocument/2006/relationships" xmlns:m="http://schemas.openxmlformats.org/officeDocument/2006/math" xmlns:v="urn:schemas-microsoft-com:vml" xmlns:wp14="http://schemas.microsoft.com/office/word/2010/wordprocessingDrawing" xmlns:wp="http://schemas.openxmlformats.org/drawingml/2006/wordprocessingDrawing" xmlns:w10="urn:schemas-microsoft-com:office:word" xmlns:w="http://schemas.openxmlformats.org/wordprocessingml/2006/main" xmlns:w14="http://schemas.microsoft.com/office/word/2010/wordml" xmlns:w15="http://schemas.microsoft.com/office/word/2012/wordml" xmlns:w16cex="http://schemas.microsoft.com/office/word/2018/wordml/cex" xmlns:w16cid="http://schemas.microsoft.com/office/word/2016/wordml/cid" xmlns:w16="http://schemas.microsoft.com/office/word/2018/wordml" xmlns:w16du="http://schemas.microsoft.com/office/word/2023/wordml/word16du" xmlns:w16sdtdh="http://schemas.microsoft.com/office/word/2020/wordml/sdtdatahash" xmlns:w16se="http://schemas.microsoft.com/office/word/2015/wordml/symex" xmlns:wpg="http://schemas.microsoft.com/office/word/2010/wordprocessingGroup" xmlns:wpi="http://schemas.microsoft.com/office/word/2010/wordprocessingInk" xmlns:wne="http://schemas.microsoft.com/office/word/2006/wordml" xmlns:wps="http://schemas.microsoft.com/office/word/2010/wordprocessingShape" mc:Ignorable="w14 w15 w16se w16cid w16 w16cex w16sdtdh w16du wp14">
   <w:footnote w:type="separator" w:id="-1">
     <w:p>
       <w:r>
@@ -1791,7 +2339,7 @@
 </file>
 
 <file path=word/header1.xml><?xml version="1.0" encoding="utf-8"?>
-<w:hdr xmlns:wpc="http://schemas.microsoft.com/office/word/2010/wordprocessingCanvas" xmlns:cx="http://schemas.microsoft.com/office/drawing/2014/chartex" xmlns:cx1="http://schemas.microsoft.com/office/drawing/2015/9/8/chartex" xmlns:cx2="http://schemas.microsoft.com/office/drawing/2015/10/21/chartex" xmlns:cx3="http://schemas.microsoft.com/office/drawing/2016/5/9/chartex" xmlns:cx4="http://schemas.microsoft.com/office/drawing/2016/5/10/chartex" xmlns:cx5="http://schemas.microsoft.com/office/drawing/2016/5/11/chartex" xmlns:cx6="http://schemas.microsoft.com/office/drawing/2016/5/12/chartex" xmlns:cx7="http://schemas.microsoft.com/office/drawing/2016/5/13/chartex" xmlns:cx8="http://schemas.microsoft.com/office/drawing/2016/5/14/chartex" xmlns:mc="http://schemas.openxmlformats.org/markup-compatibility/2006" xmlns:aink="http://schemas.microsoft.com/office/drawing/2016/ink" xmlns:am3d="http://schemas.microsoft.com/office/drawing/2017/model3d" xmlns:o="urn:schemas-microsoft-com:office:office" xmlns:oel="http://schemas.microsoft.com/office/2019/extlst" xmlns:r="http://schemas.openxmlformats.org/officeDocument/2006/relationships" xmlns:m="http://schemas.openxmlformats.org/officeDocument/2006/math" xmlns:v="urn:schemas-microsoft-com:vml" xmlns:wp14="http://schemas.microsoft.com/office/word/2010/wordprocessingDrawing" xmlns:wp="http://schemas.openxmlformats.org/drawingml/2006/wordprocessingDrawing" xmlns:w10="urn:schemas-microsoft-com:office:word" xmlns:w="http://schemas.openxmlformats.org/wordprocessingml/2006/main" xmlns:w14="http://schemas.microsoft.com/office/word/2010/wordml" xmlns:w15="http://schemas.microsoft.com/office/word/2012/wordml" xmlns:w16cex="http://schemas.microsoft.com/office/word/2018/wordml/cex" xmlns:w16cid="http://schemas.microsoft.com/office/word/2016/wordml/cid" xmlns:w16="http://schemas.microsoft.com/office/word/2018/wordml" xmlns:w16sdtdh="http://schemas.microsoft.com/office/word/2020/wordml/sdtdatahash" xmlns:w16se="http://schemas.microsoft.com/office/word/2015/wordml/symex" xmlns:wpg="http://schemas.microsoft.com/office/word/2010/wordprocessingGroup" xmlns:wpi="http://schemas.microsoft.com/office/word/2010/wordprocessingInk" xmlns:wne="http://schemas.microsoft.com/office/word/2006/wordml" xmlns:wps="http://schemas.microsoft.com/office/word/2010/wordprocessingShape" mc:Ignorable="w14 w15 w16se w16cid w16 w16cex w16sdtdh wp14">
+<w:hdr xmlns:wpc="http://schemas.microsoft.com/office/word/2010/wordprocessingCanvas" xmlns:cx="http://schemas.microsoft.com/office/drawing/2014/chartex" xmlns:cx1="http://schemas.microsoft.com/office/drawing/2015/9/8/chartex" xmlns:cx2="http://schemas.microsoft.com/office/drawing/2015/10/21/chartex" xmlns:cx3="http://schemas.microsoft.com/office/drawing/2016/5/9/chartex" xmlns:cx4="http://schemas.microsoft.com/office/drawing/2016/5/10/chartex" xmlns:cx5="http://schemas.microsoft.com/office/drawing/2016/5/11/chartex" xmlns:cx6="http://schemas.microsoft.com/office/drawing/2016/5/12/chartex" xmlns:cx7="http://schemas.microsoft.com/office/drawing/2016/5/13/chartex" xmlns:cx8="http://schemas.microsoft.com/office/drawing/2016/5/14/chartex" xmlns:mc="http://schemas.openxmlformats.org/markup-compatibility/2006" xmlns:aink="http://schemas.microsoft.com/office/drawing/2016/ink" xmlns:am3d="http://schemas.microsoft.com/office/drawing/2017/model3d" xmlns:o="urn:schemas-microsoft-com:office:office" xmlns:oel="http://schemas.microsoft.com/office/2019/extlst" xmlns:r="http://schemas.openxmlformats.org/officeDocument/2006/relationships" xmlns:m="http://schemas.openxmlformats.org/officeDocument/2006/math" xmlns:v="urn:schemas-microsoft-com:vml" xmlns:wp14="http://schemas.microsoft.com/office/word/2010/wordprocessingDrawing" xmlns:wp="http://schemas.openxmlformats.org/drawingml/2006/wordprocessingDrawing" xmlns:w10="urn:schemas-microsoft-com:office:word" xmlns:w="http://schemas.openxmlformats.org/wordprocessingml/2006/main" xmlns:w14="http://schemas.microsoft.com/office/word/2010/wordml" xmlns:w15="http://schemas.microsoft.com/office/word/2012/wordml" xmlns:w16cex="http://schemas.microsoft.com/office/word/2018/wordml/cex" xmlns:w16cid="http://schemas.microsoft.com/office/word/2016/wordml/cid" xmlns:w16="http://schemas.microsoft.com/office/word/2018/wordml" xmlns:w16du="http://schemas.microsoft.com/office/word/2023/wordml/word16du" xmlns:w16sdtdh="http://schemas.microsoft.com/office/word/2020/wordml/sdtdatahash" xmlns:w16se="http://schemas.microsoft.com/office/word/2015/wordml/symex" xmlns:wpg="http://schemas.microsoft.com/office/word/2010/wordprocessingGroup" xmlns:wpi="http://schemas.microsoft.com/office/word/2010/wordprocessingInk" xmlns:wne="http://schemas.microsoft.com/office/word/2006/wordml" xmlns:wps="http://schemas.microsoft.com/office/word/2010/wordprocessingShape" mc:Ignorable="w14 w15 w16se w16cid w16 w16cex w16sdtdh w16du wp14">
   <w:p>
     <w:pPr>
       <w:pStyle w:val="En-tte"/>
@@ -1801,7 +2349,7 @@
 </file>
 
 <file path=word/header2.xml><?xml version="1.0" encoding="utf-8"?>
-<w:hdr xmlns:wpc="http://schemas.microsoft.com/office/word/2010/wordprocessingCanvas" xmlns:cx="http://schemas.microsoft.com/office/drawing/2014/chartex" xmlns:cx1="http://schemas.microsoft.com/office/drawing/2015/9/8/chartex" xmlns:cx2="http://schemas.microsoft.com/office/drawing/2015/10/21/chartex" xmlns:cx3="http://schemas.microsoft.com/office/drawing/2016/5/9/chartex" xmlns:cx4="http://schemas.microsoft.com/office/drawing/2016/5/10/chartex" xmlns:cx5="http://schemas.microsoft.com/office/drawing/2016/5/11/chartex" xmlns:cx6="http://schemas.microsoft.com/office/drawing/2016/5/12/chartex" xmlns:cx7="http://schemas.microsoft.com/office/drawing/2016/5/13/chartex" xmlns:cx8="http://schemas.microsoft.com/office/drawing/2016/5/14/chartex" xmlns:mc="http://schemas.openxmlformats.org/markup-compatibility/2006" xmlns:aink="http://schemas.microsoft.com/office/drawing/2016/ink" xmlns:am3d="http://schemas.microsoft.com/office/drawing/2017/model3d" xmlns:o="urn:schemas-microsoft-com:office:office" xmlns:oel="http://schemas.microsoft.com/office/2019/extlst" xmlns:r="http://schemas.openxmlformats.org/officeDocument/2006/relationships" xmlns:m="http://schemas.openxmlformats.org/officeDocument/2006/math" xmlns:v="urn:schemas-microsoft-com:vml" xmlns:wp14="http://schemas.microsoft.com/office/word/2010/wordprocessingDrawing" xmlns:wp="http://schemas.openxmlformats.org/drawingml/2006/wordprocessingDrawing" xmlns:w10="urn:schemas-microsoft-com:office:word" xmlns:w="http://schemas.openxmlformats.org/wordprocessingml/2006/main" xmlns:w14="http://schemas.microsoft.com/office/word/2010/wordml" xmlns:w15="http://schemas.microsoft.com/office/word/2012/wordml" xmlns:w16cex="http://schemas.microsoft.com/office/word/2018/wordml/cex" xmlns:w16cid="http://schemas.microsoft.com/office/word/2016/wordml/cid" xmlns:w16="http://schemas.microsoft.com/office/word/2018/wordml" xmlns:w16sdtdh="http://schemas.microsoft.com/office/word/2020/wordml/sdtdatahash" xmlns:w16se="http://schemas.microsoft.com/office/word/2015/wordml/symex" xmlns:wpg="http://schemas.microsoft.com/office/word/2010/wordprocessingGroup" xmlns:wpi="http://schemas.microsoft.com/office/word/2010/wordprocessingInk" xmlns:wne="http://schemas.microsoft.com/office/word/2006/wordml" xmlns:wps="http://schemas.microsoft.com/office/word/2010/wordprocessingShape" mc:Ignorable="w14 w15 w16se w16cid w16 w16cex w16sdtdh wp14">
+<w:hdr xmlns:wpc="http://schemas.microsoft.com/office/word/2010/wordprocessingCanvas" xmlns:cx="http://schemas.microsoft.com/office/drawing/2014/chartex" xmlns:cx1="http://schemas.microsoft.com/office/drawing/2015/9/8/chartex" xmlns:cx2="http://schemas.microsoft.com/office/drawing/2015/10/21/chartex" xmlns:cx3="http://schemas.microsoft.com/office/drawing/2016/5/9/chartex" xmlns:cx4="http://schemas.microsoft.com/office/drawing/2016/5/10/chartex" xmlns:cx5="http://schemas.microsoft.com/office/drawing/2016/5/11/chartex" xmlns:cx6="http://schemas.microsoft.com/office/drawing/2016/5/12/chartex" xmlns:cx7="http://schemas.microsoft.com/office/drawing/2016/5/13/chartex" xmlns:cx8="http://schemas.microsoft.com/office/drawing/2016/5/14/chartex" xmlns:mc="http://schemas.openxmlformats.org/markup-compatibility/2006" xmlns:aink="http://schemas.microsoft.com/office/drawing/2016/ink" xmlns:am3d="http://schemas.microsoft.com/office/drawing/2017/model3d" xmlns:o="urn:schemas-microsoft-com:office:office" xmlns:oel="http://schemas.microsoft.com/office/2019/extlst" xmlns:r="http://schemas.openxmlformats.org/officeDocument/2006/relationships" xmlns:m="http://schemas.openxmlformats.org/officeDocument/2006/math" xmlns:v="urn:schemas-microsoft-com:vml" xmlns:wp14="http://schemas.microsoft.com/office/word/2010/wordprocessingDrawing" xmlns:wp="http://schemas.openxmlformats.org/drawingml/2006/wordprocessingDrawing" xmlns:w10="urn:schemas-microsoft-com:office:word" xmlns:w="http://schemas.openxmlformats.org/wordprocessingml/2006/main" xmlns:w14="http://schemas.microsoft.com/office/word/2010/wordml" xmlns:w15="http://schemas.microsoft.com/office/word/2012/wordml" xmlns:w16cex="http://schemas.microsoft.com/office/word/2018/wordml/cex" xmlns:w16cid="http://schemas.microsoft.com/office/word/2016/wordml/cid" xmlns:w16="http://schemas.microsoft.com/office/word/2018/wordml" xmlns:w16du="http://schemas.microsoft.com/office/word/2023/wordml/word16du" xmlns:w16sdtdh="http://schemas.microsoft.com/office/word/2020/wordml/sdtdatahash" xmlns:w16se="http://schemas.microsoft.com/office/word/2015/wordml/symex" xmlns:wpg="http://schemas.microsoft.com/office/word/2010/wordprocessingGroup" xmlns:wpi="http://schemas.microsoft.com/office/word/2010/wordprocessingInk" xmlns:wne="http://schemas.microsoft.com/office/word/2006/wordml" xmlns:wps="http://schemas.microsoft.com/office/word/2010/wordprocessingShape" mc:Ignorable="w14 w15 w16se w16cid w16 w16cex w16sdtdh w16du wp14">
   <w:p>
     <w:pPr>
       <w:jc w:val="right"/>
@@ -1875,7 +2423,7 @@
         <w:sz w:val="32"/>
         <w:szCs w:val="32"/>
       </w:rPr>
-      <w:t xml:space="preserve">DLA</w:t>
+      <w:t>DLA</w:t>
     </w:r>
     <w:r>
       <w:rPr>
@@ -1886,7 +2434,7 @@
         <w:szCs w:val="32"/>
       </w:rPr>
       <w:br/>
-      <w:t xml:space="preserve">Ingénieur Qualité</w:t>
+      <w:t>Ingénieur Qualité</w:t>
     </w:r>
   </w:p>
   <w:p>
@@ -1901,14 +2449,14 @@
         <w:sz w:val="32"/>
         <w:szCs w:val="32"/>
       </w:rPr>
-      <w:t xml:space="preserve">7 ans d'expériences</w:t>
+      <w:t>7 ans d'expériences</w:t>
     </w:r>
   </w:p>
 </w:hdr>
 </file>
 
 <file path=word/header3.xml><?xml version="1.0" encoding="utf-8"?>
-<w:hdr xmlns:wpc="http://schemas.microsoft.com/office/word/2010/wordprocessingCanvas" xmlns:cx="http://schemas.microsoft.com/office/drawing/2014/chartex" xmlns:cx1="http://schemas.microsoft.com/office/drawing/2015/9/8/chartex" xmlns:cx2="http://schemas.microsoft.com/office/drawing/2015/10/21/chartex" xmlns:cx3="http://schemas.microsoft.com/office/drawing/2016/5/9/chartex" xmlns:cx4="http://schemas.microsoft.com/office/drawing/2016/5/10/chartex" xmlns:cx5="http://schemas.microsoft.com/office/drawing/2016/5/11/chartex" xmlns:cx6="http://schemas.microsoft.com/office/drawing/2016/5/12/chartex" xmlns:cx7="http://schemas.microsoft.com/office/drawing/2016/5/13/chartex" xmlns:cx8="http://schemas.microsoft.com/office/drawing/2016/5/14/chartex" xmlns:mc="http://schemas.openxmlformats.org/markup-compatibility/2006" xmlns:aink="http://schemas.microsoft.com/office/drawing/2016/ink" xmlns:am3d="http://schemas.microsoft.com/office/drawing/2017/model3d" xmlns:o="urn:schemas-microsoft-com:office:office" xmlns:oel="http://schemas.microsoft.com/office/2019/extlst" xmlns:r="http://schemas.openxmlformats.org/officeDocument/2006/relationships" xmlns:m="http://schemas.openxmlformats.org/officeDocument/2006/math" xmlns:v="urn:schemas-microsoft-com:vml" xmlns:wp14="http://schemas.microsoft.com/office/word/2010/wordprocessingDrawing" xmlns:wp="http://schemas.openxmlformats.org/drawingml/2006/wordprocessingDrawing" xmlns:w10="urn:schemas-microsoft-com:office:word" xmlns:w="http://schemas.openxmlformats.org/wordprocessingml/2006/main" xmlns:w14="http://schemas.microsoft.com/office/word/2010/wordml" xmlns:w15="http://schemas.microsoft.com/office/word/2012/wordml" xmlns:w16cex="http://schemas.microsoft.com/office/word/2018/wordml/cex" xmlns:w16cid="http://schemas.microsoft.com/office/word/2016/wordml/cid" xmlns:w16="http://schemas.microsoft.com/office/word/2018/wordml" xmlns:w16sdtdh="http://schemas.microsoft.com/office/word/2020/wordml/sdtdatahash" xmlns:w16se="http://schemas.microsoft.com/office/word/2015/wordml/symex" xmlns:wpg="http://schemas.microsoft.com/office/word/2010/wordprocessingGroup" xmlns:wpi="http://schemas.microsoft.com/office/word/2010/wordprocessingInk" xmlns:wne="http://schemas.microsoft.com/office/word/2006/wordml" xmlns:wps="http://schemas.microsoft.com/office/word/2010/wordprocessingShape" mc:Ignorable="w14 w15 w16se w16cid w16 w16cex w16sdtdh wp14">
+<w:hdr xmlns:wpc="http://schemas.microsoft.com/office/word/2010/wordprocessingCanvas" xmlns:cx="http://schemas.microsoft.com/office/drawing/2014/chartex" xmlns:cx1="http://schemas.microsoft.com/office/drawing/2015/9/8/chartex" xmlns:cx2="http://schemas.microsoft.com/office/drawing/2015/10/21/chartex" xmlns:cx3="http://schemas.microsoft.com/office/drawing/2016/5/9/chartex" xmlns:cx4="http://schemas.microsoft.com/office/drawing/2016/5/10/chartex" xmlns:cx5="http://schemas.microsoft.com/office/drawing/2016/5/11/chartex" xmlns:cx6="http://schemas.microsoft.com/office/drawing/2016/5/12/chartex" xmlns:cx7="http://schemas.microsoft.com/office/drawing/2016/5/13/chartex" xmlns:cx8="http://schemas.microsoft.com/office/drawing/2016/5/14/chartex" xmlns:mc="http://schemas.openxmlformats.org/markup-compatibility/2006" xmlns:aink="http://schemas.microsoft.com/office/drawing/2016/ink" xmlns:am3d="http://schemas.microsoft.com/office/drawing/2017/model3d" xmlns:o="urn:schemas-microsoft-com:office:office" xmlns:oel="http://schemas.microsoft.com/office/2019/extlst" xmlns:r="http://schemas.openxmlformats.org/officeDocument/2006/relationships" xmlns:m="http://schemas.openxmlformats.org/officeDocument/2006/math" xmlns:v="urn:schemas-microsoft-com:vml" xmlns:wp14="http://schemas.microsoft.com/office/word/2010/wordprocessingDrawing" xmlns:wp="http://schemas.openxmlformats.org/drawingml/2006/wordprocessingDrawing" xmlns:w10="urn:schemas-microsoft-com:office:word" xmlns:w="http://schemas.openxmlformats.org/wordprocessingml/2006/main" xmlns:w14="http://schemas.microsoft.com/office/word/2010/wordml" xmlns:w15="http://schemas.microsoft.com/office/word/2012/wordml" xmlns:w16cex="http://schemas.microsoft.com/office/word/2018/wordml/cex" xmlns:w16cid="http://schemas.microsoft.com/office/word/2016/wordml/cid" xmlns:w16="http://schemas.microsoft.com/office/word/2018/wordml" xmlns:w16du="http://schemas.microsoft.com/office/word/2023/wordml/word16du" xmlns:w16sdtdh="http://schemas.microsoft.com/office/word/2020/wordml/sdtdatahash" xmlns:w16se="http://schemas.microsoft.com/office/word/2015/wordml/symex" xmlns:wpg="http://schemas.microsoft.com/office/word/2010/wordprocessingGroup" xmlns:wpi="http://schemas.microsoft.com/office/word/2010/wordprocessingInk" xmlns:wne="http://schemas.microsoft.com/office/word/2006/wordml" xmlns:wps="http://schemas.microsoft.com/office/word/2010/wordprocessingShape" mc:Ignorable="w14 w15 w16se w16cid w16 w16cex w16sdtdh w16du wp14">
   <w:p>
     <w:pPr>
       <w:jc w:val="right"/>
@@ -1982,7 +2530,7 @@
         <w:sz w:val="32"/>
         <w:szCs w:val="32"/>
       </w:rPr>
-      <w:t xml:space="preserve">DLA</w:t>
+      <w:t>DLA</w:t>
     </w:r>
     <w:r>
       <w:rPr>
@@ -1993,7 +2541,7 @@
         <w:szCs w:val="32"/>
       </w:rPr>
       <w:br/>
-      <w:t xml:space="preserve">Ingénieur Qualité</w:t>
+      <w:t>Ingénieur Qualité</w:t>
     </w:r>
   </w:p>
   <w:p>
@@ -2008,17 +2556,17 @@
         <w:sz w:val="32"/>
         <w:szCs w:val="32"/>
       </w:rPr>
-      <w:t xml:space="preserve">7 ans d'expériences</w:t>
+      <w:t>7 ans d'expériences</w:t>
     </w:r>
   </w:p>
 </w:hdr>
 </file>
 
 <file path=word/numbering.xml><?xml version="1.0" encoding="utf-8"?>
-<w:numbering xmlns:wpc="http://schemas.microsoft.com/office/word/2010/wordprocessingCanvas" xmlns:cx="http://schemas.microsoft.com/office/drawing/2014/chartex" xmlns:cx1="http://schemas.microsoft.com/office/drawing/2015/9/8/chartex" xmlns:cx2="http://schemas.microsoft.com/office/drawing/2015/10/21/chartex" xmlns:cx3="http://schemas.microsoft.com/office/drawing/2016/5/9/chartex" xmlns:cx4="http://schemas.microsoft.com/office/drawing/2016/5/10/chartex" xmlns:cx5="http://schemas.microsoft.com/office/drawing/2016/5/11/chartex" xmlns:cx6="http://schemas.microsoft.com/office/drawing/2016/5/12/chartex" xmlns:cx7="http://schemas.microsoft.com/office/drawing/2016/5/13/chartex" xmlns:cx8="http://schemas.microsoft.com/office/drawing/2016/5/14/chartex" xmlns:mc="http://schemas.openxmlformats.org/markup-compatibility/2006" xmlns:aink="http://schemas.microsoft.com/office/drawing/2016/ink" xmlns:am3d="http://schemas.microsoft.com/office/drawing/2017/model3d" xmlns:o="urn:schemas-microsoft-com:office:office" xmlns:oel="http://schemas.microsoft.com/office/2019/extlst" xmlns:r="http://schemas.openxmlformats.org/officeDocument/2006/relationships" xmlns:m="http://schemas.openxmlformats.org/officeDocument/2006/math" xmlns:v="urn:schemas-microsoft-com:vml" xmlns:wp14="http://schemas.microsoft.com/office/word/2010/wordprocessingDrawing" xmlns:wp="http://schemas.openxmlformats.org/drawingml/2006/wordprocessingDrawing" xmlns:w10="urn:schemas-microsoft-com:office:word" xmlns:w="http://schemas.openxmlformats.org/wordprocessingml/2006/main" xmlns:w14="http://schemas.microsoft.com/office/word/2010/wordml" xmlns:w15="http://schemas.microsoft.com/office/word/2012/wordml" xmlns:w16cex="http://schemas.microsoft.com/office/word/2018/wordml/cex" xmlns:w16cid="http://schemas.microsoft.com/office/word/2016/wordml/cid" xmlns:w16="http://schemas.microsoft.com/office/word/2018/wordml" xmlns:w16sdtdh="http://schemas.microsoft.com/office/word/2020/wordml/sdtdatahash" xmlns:w16se="http://schemas.microsoft.com/office/word/2015/wordml/symex" xmlns:wpg="http://schemas.microsoft.com/office/word/2010/wordprocessingGroup" xmlns:wpi="http://schemas.microsoft.com/office/word/2010/wordprocessingInk" xmlns:wne="http://schemas.microsoft.com/office/word/2006/wordml" xmlns:wps="http://schemas.microsoft.com/office/word/2010/wordprocessingShape" mc:Ignorable="w14 w15 w16se w16cid w16 w16cex w16sdtdh wp14">
+<w:numbering xmlns:wpc="http://schemas.microsoft.com/office/word/2010/wordprocessingCanvas" xmlns:cx="http://schemas.microsoft.com/office/drawing/2014/chartex" xmlns:cx1="http://schemas.microsoft.com/office/drawing/2015/9/8/chartex" xmlns:cx2="http://schemas.microsoft.com/office/drawing/2015/10/21/chartex" xmlns:cx3="http://schemas.microsoft.com/office/drawing/2016/5/9/chartex" xmlns:cx4="http://schemas.microsoft.com/office/drawing/2016/5/10/chartex" xmlns:cx5="http://schemas.microsoft.com/office/drawing/2016/5/11/chartex" xmlns:cx6="http://schemas.microsoft.com/office/drawing/2016/5/12/chartex" xmlns:cx7="http://schemas.microsoft.com/office/drawing/2016/5/13/chartex" xmlns:cx8="http://schemas.microsoft.com/office/drawing/2016/5/14/chartex" xmlns:mc="http://schemas.openxmlformats.org/markup-compatibility/2006" xmlns:aink="http://schemas.microsoft.com/office/drawing/2016/ink" xmlns:am3d="http://schemas.microsoft.com/office/drawing/2017/model3d" xmlns:o="urn:schemas-microsoft-com:office:office" xmlns:oel="http://schemas.microsoft.com/office/2019/extlst" xmlns:r="http://schemas.openxmlformats.org/officeDocument/2006/relationships" xmlns:m="http://schemas.openxmlformats.org/officeDocument/2006/math" xmlns:v="urn:schemas-microsoft-com:vml" xmlns:wp14="http://schemas.microsoft.com/office/word/2010/wordprocessingDrawing" xmlns:wp="http://schemas.openxmlformats.org/drawingml/2006/wordprocessingDrawing" xmlns:w10="urn:schemas-microsoft-com:office:word" xmlns:w="http://schemas.openxmlformats.org/wordprocessingml/2006/main" xmlns:w14="http://schemas.microsoft.com/office/word/2010/wordml" xmlns:w15="http://schemas.microsoft.com/office/word/2012/wordml" xmlns:w16cex="http://schemas.microsoft.com/office/word/2018/wordml/cex" xmlns:w16cid="http://schemas.microsoft.com/office/word/2016/wordml/cid" xmlns:w16="http://schemas.microsoft.com/office/word/2018/wordml" xmlns:w16du="http://schemas.microsoft.com/office/word/2023/wordml/word16du" xmlns:w16sdtdh="http://schemas.microsoft.com/office/word/2020/wordml/sdtdatahash" xmlns:w16se="http://schemas.microsoft.com/office/word/2015/wordml/symex" xmlns:wpg="http://schemas.microsoft.com/office/word/2010/wordprocessingGroup" xmlns:wpi="http://schemas.microsoft.com/office/word/2010/wordprocessingInk" xmlns:wne="http://schemas.microsoft.com/office/word/2006/wordml" xmlns:wps="http://schemas.microsoft.com/office/word/2010/wordprocessingShape" mc:Ignorable="w14 w15 w16se w16cid w16 w16cex w16sdtdh w16du wp14">
   <w:numPicBullet w:numPicBulletId="0">
     <w:pict>
-      <v:shape id="_x0000_i1045" style="width:165pt;height:165pt" coordsize="" o:spt="100" o:bullet="t" adj="0,,0" path="" stroked="f">
+      <v:shape id="_x0000_i1042" style="width:165.5pt;height:165.5pt" coordsize="" o:spt="100" o:bullet="t" adj="0,,0" path="" stroked="f">
         <v:stroke joinstyle="miter"/>
         <v:imagedata r:id="rId1" o:title=""/>
         <v:formulas/>
@@ -3434,7 +3982,7 @@
 </file>
 
 <file path=word/styles.xml><?xml version="1.0" encoding="utf-8"?>
-<w:styles xmlns:mc="http://schemas.openxmlformats.org/markup-compatibility/2006" xmlns:r="http://schemas.openxmlformats.org/officeDocument/2006/relationships" xmlns:w="http://schemas.openxmlformats.org/wordprocessingml/2006/main" xmlns:w14="http://schemas.microsoft.com/office/word/2010/wordml" xmlns:w15="http://schemas.microsoft.com/office/word/2012/wordml" xmlns:w16cex="http://schemas.microsoft.com/office/word/2018/wordml/cex" xmlns:w16cid="http://schemas.microsoft.com/office/word/2016/wordml/cid" xmlns:w16="http://schemas.microsoft.com/office/word/2018/wordml" xmlns:w16sdtdh="http://schemas.microsoft.com/office/word/2020/wordml/sdtdatahash" xmlns:w16se="http://schemas.microsoft.com/office/word/2015/wordml/symex" mc:Ignorable="w14 w15 w16se w16cid w16 w16cex w16sdtdh">
+<w:styles xmlns:mc="http://schemas.openxmlformats.org/markup-compatibility/2006" xmlns:r="http://schemas.openxmlformats.org/officeDocument/2006/relationships" xmlns:w="http://schemas.openxmlformats.org/wordprocessingml/2006/main" xmlns:w14="http://schemas.microsoft.com/office/word/2010/wordml" xmlns:w15="http://schemas.microsoft.com/office/word/2012/wordml" xmlns:w16cex="http://schemas.microsoft.com/office/word/2018/wordml/cex" xmlns:w16cid="http://schemas.microsoft.com/office/word/2016/wordml/cid" xmlns:w16="http://schemas.microsoft.com/office/word/2018/wordml" xmlns:w16du="http://schemas.microsoft.com/office/word/2023/wordml/word16du" xmlns:w16sdtdh="http://schemas.microsoft.com/office/word/2020/wordml/sdtdatahash" xmlns:w16se="http://schemas.microsoft.com/office/word/2015/wordml/symex" mc:Ignorable="w14 w15 w16se w16cid w16 w16cex w16sdtdh w16du">
   <w:docDefaults>
     <w:rPrDefault>
       <w:rPr>
@@ -4448,25 +4996,6 @@
 </file>
 
 <file path=customXml/item1.xml><?xml version="1.0" encoding="utf-8"?>
-<p:properties xmlns:p="http://schemas.microsoft.com/office/2006/metadata/properties" xmlns:xsi="http://www.w3.org/2001/XMLSchema-instance" xmlns:pc="http://schemas.microsoft.com/office/infopath/2007/PartnerControls">
-  <documentManagement/>
-</p:properties>
-</file>
-
-<file path=customXml/item2.xml><?xml version="1.0" encoding="utf-8"?>
-<?mso-contentType ?>
-<FormTemplates xmlns="http://schemas.microsoft.com/sharepoint/v3/contenttype/forms">
-  <Display>DocumentLibraryForm</Display>
-  <Edit>DocumentLibraryForm</Edit>
-  <New>DocumentLibraryForm</New>
-</FormTemplates>
-</file>
-
-<file path=customXml/item3.xml><?xml version="1.0" encoding="utf-8"?>
-<b:Sources xmlns:b="http://schemas.openxmlformats.org/officeDocument/2006/bibliography" xmlns="http://schemas.openxmlformats.org/officeDocument/2006/bibliography" SelectedStyle="\APASixthEditionOfficeOnline.xsl" StyleName="APA" Version="6"/>
-</file>
-
-<file path=customXml/item4.xml><?xml version="1.0" encoding="utf-8"?>
 <ct:contentTypeSchema xmlns:ct="http://schemas.microsoft.com/office/2006/metadata/contentType" xmlns:ma="http://schemas.microsoft.com/office/2006/metadata/properties/metaAttributes" ct:_="" ma:_="" ma:contentTypeName="Document" ma:contentTypeID="0x010100767C9B16D5F44342850AAF6F7A657EE2" ma:contentTypeVersion="13" ma:contentTypeDescription="Crée un document." ma:contentTypeScope="" ma:versionID="3dfd0ed4f7a1ffb00a66e6020b776702">
   <xsd:schema xmlns:xsd="http://www.w3.org/2001/XMLSchema" xmlns:xs="http://www.w3.org/2001/XMLSchema" xmlns:p="http://schemas.microsoft.com/office/2006/metadata/properties" xmlns:ns2="24951bd1-abaf-4ce5-abfd-d427fc0f1947" xmlns:ns3="bdbad5c6-c323-4ecc-a7f0-445736588319" targetNamespace="http://schemas.microsoft.com/office/2006/metadata/properties" ma:root="true" ma:fieldsID="9e2d2818ac17038ee33c8c7108338d1b" ns2:_="" ns3:_="">
     <xsd:import namespace="24951bd1-abaf-4ce5-abfd-d427fc0f1947"/>
@@ -4689,32 +5218,26 @@
 </ct:contentTypeSchema>
 </file>
 
-<file path=customXml/itemProps1.xml><?xml version="1.0" encoding="utf-8"?>
-<ds:datastoreItem xmlns:ds="http://schemas.openxmlformats.org/officeDocument/2006/customXml" ds:itemID="{0363A018-813C-488E-8021-00AAA46C4A9C}">
-  <ds:schemaRefs>
-    <ds:schemaRef ds:uri="http://schemas.microsoft.com/office/2006/metadata/properties"/>
-    <ds:schemaRef ds:uri="http://schemas.microsoft.com/office/infopath/2007/PartnerControls"/>
-  </ds:schemaRefs>
-</ds:datastoreItem>
+<file path=customXml/item2.xml><?xml version="1.0" encoding="utf-8"?>
+<b:Sources xmlns:b="http://schemas.openxmlformats.org/officeDocument/2006/bibliography" xmlns="http://schemas.openxmlformats.org/officeDocument/2006/bibliography" SelectedStyle="\APASixthEditionOfficeOnline.xsl" StyleName="APA" Version="6"/>
 </file>
 
-<file path=customXml/itemProps2.xml><?xml version="1.0" encoding="utf-8"?>
-<ds:datastoreItem xmlns:ds="http://schemas.openxmlformats.org/officeDocument/2006/customXml" ds:itemID="{ACD0E240-7E6B-4E54-A8D6-40E876E019BB}">
-  <ds:schemaRefs>
-    <ds:schemaRef ds:uri="http://schemas.microsoft.com/sharepoint/v3/contenttype/forms"/>
-  </ds:schemaRefs>
-</ds:datastoreItem>
+<file path=customXml/item3.xml><?xml version="1.0" encoding="utf-8"?>
+<?mso-contentType ?>
+<FormTemplates xmlns="http://schemas.microsoft.com/sharepoint/v3/contenttype/forms">
+  <Display>DocumentLibraryForm</Display>
+  <Edit>DocumentLibraryForm</Edit>
+  <New>DocumentLibraryForm</New>
+</FormTemplates>
 </file>
 
-<file path=customXml/itemProps3.xml><?xml version="1.0" encoding="utf-8"?>
-<ds:datastoreItem xmlns:ds="http://schemas.openxmlformats.org/officeDocument/2006/customXml" ds:itemID="{18381856-7B3A-419B-AE55-07EF15B4463D}">
-  <ds:schemaRefs>
-    <ds:schemaRef ds:uri="http://schemas.openxmlformats.org/officeDocument/2006/bibliography"/>
-  </ds:schemaRefs>
-</ds:datastoreItem>
+<file path=customXml/item4.xml><?xml version="1.0" encoding="utf-8"?>
+<p:properties xmlns:p="http://schemas.microsoft.com/office/2006/metadata/properties" xmlns:xsi="http://www.w3.org/2001/XMLSchema-instance" xmlns:pc="http://schemas.microsoft.com/office/infopath/2007/PartnerControls">
+  <documentManagement/>
+</p:properties>
 </file>
 
-<file path=customXml/itemProps4.xml><?xml version="1.0" encoding="utf-8"?>
+<file path=customXml/itemProps1.xml><?xml version="1.0" encoding="utf-8"?>
 <ds:datastoreItem xmlns:ds="http://schemas.openxmlformats.org/officeDocument/2006/customXml" ds:itemID="{ED10D3F5-98DD-4C9C-A2EC-99AF8C1721C1}">
   <ds:schemaRefs>
     <ds:schemaRef ds:uri="http://schemas.microsoft.com/office/2006/metadata/contentType"/>
@@ -4731,4 +5254,29 @@
     <ds:schemaRef ds:uri="http://schemas.microsoft.com/internal/obd"/>
   </ds:schemaRefs>
 </ds:datastoreItem>
+</file>
+
+<file path=customXml/itemProps2.xml><?xml version="1.0" encoding="utf-8"?>
+<ds:datastoreItem xmlns:ds="http://schemas.openxmlformats.org/officeDocument/2006/customXml" ds:itemID="{18381856-7B3A-419B-AE55-07EF15B4463D}">
+  <ds:schemaRefs>
+    <ds:schemaRef ds:uri="http://schemas.openxmlformats.org/officeDocument/2006/bibliography"/>
+  </ds:schemaRefs>
+</ds:datastoreItem>
+</file>
+
+<file path=customXml/itemProps3.xml><?xml version="1.0" encoding="utf-8"?>
+<ds:datastoreItem xmlns:ds="http://schemas.openxmlformats.org/officeDocument/2006/customXml" ds:itemID="{ACD0E240-7E6B-4E54-A8D6-40E876E019BB}">
+  <ds:schemaRefs>
+    <ds:schemaRef ds:uri="http://schemas.microsoft.com/sharepoint/v3/contenttype/forms"/>
+  </ds:schemaRefs>
+</ds:datastoreItem>
+</file>
+
+<file path=customXml/itemProps4.xml><?xml version="1.0" encoding="utf-8"?>
+<ds:datastoreItem xmlns:ds="http://schemas.openxmlformats.org/officeDocument/2006/customXml" ds:itemID="{0363A018-813C-488E-8021-00AAA46C4A9C}">
+  <ds:schemaRefs>
+    <ds:schemaRef ds:uri="http://schemas.microsoft.com/office/2006/metadata/properties"/>
+    <ds:schemaRef ds:uri="http://schemas.microsoft.com/office/infopath/2007/PartnerControls"/>
+  </ds:schemaRefs>
+</ds:datastoreItem>
 </file>
</xml_diff>